<commit_message>
Corr - solved? Popup
I created the ishmedTest in newMacros and now imported the other sources again into the templateProject. From ishmedTest I now call the original ishmedTest which I renamed to ishmedEntry. So that all points to a problem with referencing the ishmedTest or any Sub that resides in the ProjectTemplate? And yes the .dot is still attached.
</commit_message>
<xml_diff>
--- a/XTTEMP_PaArztBrief_Version71.docx
+++ b/XTTEMP_PaArztBrief_Version71.docx
@@ -2,6 +2,8 @@
 <file path=word/document.xml><?xml version="1.0" encoding="utf-8"?>
 <w:document xmlns:wpc="http://schemas.microsoft.com/office/word/2010/wordprocessingCanvas" xmlns:cx="http://schemas.microsoft.com/office/drawing/2014/chartex" xmlns:cx1="http://schemas.microsoft.com/office/drawing/2015/9/8/chartex" xmlns:mc="http://schemas.openxmlformats.org/markup-compatibility/2006" xmlns:o="urn:schemas-microsoft-com:office:office" xmlns:r="http://schemas.openxmlformats.org/officeDocument/2006/relationships" xmlns:m="http://schemas.openxmlformats.org/officeDocument/2006/math" xmlns:v="urn:schemas-microsoft-com:vml" xmlns:wp14="http://schemas.microsoft.com/office/word/2010/wordprocessingDrawing" xmlns:wp="http://schemas.openxmlformats.org/drawingml/2006/wordprocessingDrawing" xmlns:w10="urn:schemas-microsoft-com:office:word" xmlns:w="http://schemas.openxmlformats.org/wordprocessingml/2006/main" xmlns:w14="http://schemas.microsoft.com/office/word/2010/wordml" xmlns:w15="http://schemas.microsoft.com/office/word/2012/wordml" xmlns:w16se="http://schemas.microsoft.com/office/word/2015/wordml/symex" xmlns:wpg="http://schemas.microsoft.com/office/word/2010/wordprocessingGroup" xmlns:wpi="http://schemas.microsoft.com/office/word/2010/wordprocessingInk" xmlns:wne="http://schemas.microsoft.com/office/word/2006/wordml" xmlns:wps="http://schemas.microsoft.com/office/word/2010/wordprocessingShape" mc:Ignorable="w14 w15 w16se wp14">
   <w:body>
+    <w:bookmarkStart w:id="0" w:name="_GoBack" w:displacedByCustomXml="next"/>
+    <w:bookmarkEnd w:id="0" w:displacedByCustomXml="next"/>
     <w:sdt>
       <w:sdtPr>
         <w:id w:val="-1545900017"/>
@@ -11,6 +13,7 @@
         </w:placeholder>
         <w:group/>
       </w:sdtPr>
+      <w:sdtEndPr/>
       <w:sdtContent>
         <w:p>
           <w:pPr>
@@ -80,8 +83,8 @@
                                   <w:tblLook w:val="04A0" w:firstRow="1" w:lastRow="0" w:firstColumn="1" w:lastColumn="0" w:noHBand="0" w:noVBand="1"/>
                                 </w:tblPr>
                                 <w:tblGrid>
-                                  <w:gridCol w:w="2327"/>
-                                  <w:gridCol w:w="852"/>
+                                  <w:gridCol w:w="2326"/>
+                                  <w:gridCol w:w="853"/>
                                 </w:tblGrid>
                                 <w:tr>
                                   <w:tc>
@@ -126,8 +129,20 @@
                                           <w:szCs w:val="15"/>
                                           <w:lang w:eastAsia="en-US"/>
                                         </w:rPr>
-                                        <w:t xml:space="preserve"> Jan Knierim</w:t>
+                                        <w:t xml:space="preserve"> Jan </w:t>
                                       </w:r>
+                                      <w:proofErr w:type="spellStart"/>
+                                      <w:r>
+                                        <w:rPr>
+                                          <w:rFonts w:cs="Arial"/>
+                                          <w:b/>
+                                          <w:sz w:val="15"/>
+                                          <w:szCs w:val="15"/>
+                                          <w:lang w:eastAsia="en-US"/>
+                                        </w:rPr>
+                                        <w:t>Knierim</w:t>
+                                      </w:r>
+                                      <w:proofErr w:type="spellEnd"/>
                                       <w:r>
                                         <w:rPr>
                                           <w:rFonts w:cs="Arial"/>
@@ -325,7 +340,7 @@
                                         </w:rPr>
                                         <w:br/>
                                       </w:r>
-                                      <w:hyperlink r:id="rId4" w:history="1">
+                                      <w:hyperlink r:id="rId6" w:history="1">
                                         <w:r>
                                           <w:rPr>
                                             <w:rStyle w:val="Hyperlink"/>
@@ -398,7 +413,7 @@
                                         </w:rPr>
                                         <w:t xml:space="preserve">Berlin, </w:t>
                                       </w:r>
-                                      <w:bookmarkStart w:id="0" w:name="AUTODATE"/>
+                                      <w:bookmarkStart w:id="1" w:name="AUTODATE"/>
                                       <w:r>
                                         <w:rPr>
                                           <w:rFonts w:cs="Arial"/>
@@ -408,8 +423,8 @@
                                         </w:rPr>
                                         <w:t>03.06.2026</w:t>
                                       </w:r>
-                                      <w:bookmarkStart w:id="1" w:name="HIDDEN_CREATE_STATUS"/>
-                                      <w:bookmarkEnd w:id="0"/>
+                                      <w:bookmarkStart w:id="2" w:name="HIDDEN_CREATE_STATUS"/>
+                                      <w:bookmarkEnd w:id="1"/>
                                       <w:r>
                                         <w:rPr>
                                           <w:rFonts w:cs="Arial"/>
@@ -420,7 +435,7 @@
                                         </w:rPr>
                                         <w:t>[X]</w:t>
                                       </w:r>
-                                      <w:bookmarkEnd w:id="1"/>
+                                      <w:bookmarkEnd w:id="2"/>
                                       <w:r>
                                         <w:rPr>
                                           <w:rFonts w:cs="Arial"/>
@@ -562,8 +577,8 @@
                             <w:tblLook w:val="04A0" w:firstRow="1" w:lastRow="0" w:firstColumn="1" w:lastColumn="0" w:noHBand="0" w:noVBand="1"/>
                           </w:tblPr>
                           <w:tblGrid>
-                            <w:gridCol w:w="2327"/>
-                            <w:gridCol w:w="852"/>
+                            <w:gridCol w:w="2326"/>
+                            <w:gridCol w:w="853"/>
                           </w:tblGrid>
                           <w:tr>
                             <w:tc>
@@ -608,8 +623,20 @@
                                     <w:szCs w:val="15"/>
                                     <w:lang w:eastAsia="en-US"/>
                                   </w:rPr>
-                                  <w:t xml:space="preserve"> Jan Knierim</w:t>
+                                  <w:t xml:space="preserve"> Jan </w:t>
                                 </w:r>
+                                <w:proofErr w:type="spellStart"/>
+                                <w:r>
+                                  <w:rPr>
+                                    <w:rFonts w:cs="Arial"/>
+                                    <w:b/>
+                                    <w:sz w:val="15"/>
+                                    <w:szCs w:val="15"/>
+                                    <w:lang w:eastAsia="en-US"/>
+                                  </w:rPr>
+                                  <w:t>Knierim</w:t>
+                                </w:r>
+                                <w:proofErr w:type="spellEnd"/>
                                 <w:r>
                                   <w:rPr>
                                     <w:rFonts w:cs="Arial"/>
@@ -807,7 +834,7 @@
                                   </w:rPr>
                                   <w:br/>
                                 </w:r>
-                                <w:hyperlink r:id="rId5" w:history="1">
+                                <w:hyperlink r:id="rId7" w:history="1">
                                   <w:r>
                                     <w:rPr>
                                       <w:rStyle w:val="Hyperlink"/>
@@ -880,7 +907,7 @@
                                   </w:rPr>
                                   <w:t xml:space="preserve">Berlin, </w:t>
                                 </w:r>
-                                <w:bookmarkStart w:id="2" w:name="AUTODATE"/>
+                                <w:bookmarkStart w:id="3" w:name="AUTODATE"/>
                                 <w:r>
                                   <w:rPr>
                                     <w:rFonts w:cs="Arial"/>
@@ -890,8 +917,8 @@
                                   </w:rPr>
                                   <w:t>03.06.2026</w:t>
                                 </w:r>
-                                <w:bookmarkStart w:id="3" w:name="HIDDEN_CREATE_STATUS"/>
-                                <w:bookmarkEnd w:id="2"/>
+                                <w:bookmarkStart w:id="4" w:name="HIDDEN_CREATE_STATUS"/>
+                                <w:bookmarkEnd w:id="3"/>
                                 <w:r>
                                   <w:rPr>
                                     <w:rFonts w:cs="Arial"/>
@@ -902,7 +929,7 @@
                                   </w:rPr>
                                   <w:t>[X]</w:t>
                                 </w:r>
-                                <w:bookmarkEnd w:id="3"/>
+                                <w:bookmarkEnd w:id="4"/>
                                 <w:r>
                                   <w:rPr>
                                     <w:rFonts w:cs="Arial"/>
@@ -1015,12 +1042,12 @@
           <w:pPr>
             <w:pStyle w:val="Logo"/>
             <w:sectPr>
-              <w:headerReference w:type="even" r:id="rId6"/>
-              <w:headerReference w:type="default" r:id="rId7"/>
-              <w:footerReference w:type="even" r:id="rId8"/>
-              <w:footerReference w:type="default" r:id="rId9"/>
-              <w:headerReference w:type="first" r:id="rId10"/>
-              <w:footerReference w:type="first" r:id="rId11"/>
+              <w:headerReference w:type="even" r:id="rId8"/>
+              <w:headerReference w:type="default" r:id="rId9"/>
+              <w:footerReference w:type="even" r:id="rId10"/>
+              <w:footerReference w:type="default" r:id="rId11"/>
+              <w:headerReference w:type="first" r:id="rId12"/>
+              <w:footerReference w:type="first" r:id="rId13"/>
               <w:type w:val="continuous"/>
               <w:pgSz w:w="11906" w:h="16838" w:code="9"/>
               <w:pgMar w:top="2516" w:right="1418" w:bottom="1304" w:left="1418" w:header="709" w:footer="709" w:gutter="0"/>
@@ -1171,7 +1198,7 @@
           </w:ffData>
         </w:fldChar>
       </w:r>
-      <w:bookmarkStart w:id="5" w:name="STRASSERST"/>
+      <w:bookmarkStart w:id="6" w:name="STRASSERST"/>
       <w:r>
         <w:instrText xml:space="preserve"> FORMTEXT </w:instrText>
       </w:r>
@@ -1211,7 +1238,7 @@
       <w:r>
         <w:fldChar w:fldCharType="end"/>
       </w:r>
-      <w:bookmarkEnd w:id="5"/>
+      <w:bookmarkEnd w:id="6"/>
       <w:r>
         <w:tab/>
       </w:r>
@@ -1288,7 +1315,7 @@
           </w:ffData>
         </w:fldChar>
       </w:r>
-      <w:bookmarkStart w:id="6" w:name="ORTERST"/>
+      <w:bookmarkStart w:id="7" w:name="ORTERST"/>
       <w:r>
         <w:instrText xml:space="preserve"> FORMTEXT </w:instrText>
       </w:r>
@@ -1328,7 +1355,7 @@
       <w:r>
         <w:fldChar w:fldCharType="end"/>
       </w:r>
-      <w:bookmarkEnd w:id="6"/>
+      <w:bookmarkEnd w:id="7"/>
     </w:p>
     <w:p/>
     <w:p/>
@@ -1454,7 +1481,7 @@
           </w:ffData>
         </w:fldChar>
       </w:r>
-      <w:bookmarkStart w:id="7" w:name="NAMEINFO3"/>
+      <w:bookmarkStart w:id="8" w:name="NAMEINFO3"/>
       <w:r>
         <w:instrText xml:space="preserve"> FORMTEXT </w:instrText>
       </w:r>
@@ -1494,7 +1521,7 @@
       <w:r>
         <w:fldChar w:fldCharType="end"/>
       </w:r>
-      <w:bookmarkEnd w:id="7"/>
+      <w:bookmarkEnd w:id="8"/>
     </w:p>
     <w:p>
       <w:r>
@@ -1507,7 +1534,7 @@
           </w:ffData>
         </w:fldChar>
       </w:r>
-      <w:bookmarkStart w:id="8" w:name="NAMEINFO4"/>
+      <w:bookmarkStart w:id="9" w:name="NAMEINFO4"/>
       <w:r>
         <w:instrText xml:space="preserve"> FORMTEXT </w:instrText>
       </w:r>
@@ -1547,7 +1574,7 @@
       <w:r>
         <w:fldChar w:fldCharType="end"/>
       </w:r>
-      <w:bookmarkEnd w:id="8"/>
+      <w:bookmarkEnd w:id="9"/>
     </w:p>
     <w:p>
       <w:r>
@@ -1560,7 +1587,7 @@
           </w:ffData>
         </w:fldChar>
       </w:r>
-      <w:bookmarkStart w:id="9" w:name="NAMEINFO5"/>
+      <w:bookmarkStart w:id="10" w:name="NAMEINFO5"/>
       <w:r>
         <w:instrText xml:space="preserve"> FORMTEXT </w:instrText>
       </w:r>
@@ -1600,7 +1627,7 @@
       <w:r>
         <w:fldChar w:fldCharType="end"/>
       </w:r>
-      <w:bookmarkEnd w:id="9"/>
+      <w:bookmarkEnd w:id="10"/>
     </w:p>
     <w:p/>
     <w:p/>
@@ -1616,7 +1643,7 @@
           </w:ffData>
         </w:fldChar>
       </w:r>
-      <w:bookmarkStart w:id="10" w:name="ANSPRACHE"/>
+      <w:bookmarkStart w:id="11" w:name="ANSPRACHE"/>
       <w:r>
         <w:instrText xml:space="preserve"> FORMTEXT </w:instrText>
       </w:r>
@@ -1656,7 +1683,7 @@
       <w:r>
         <w:fldChar w:fldCharType="end"/>
       </w:r>
-      <w:bookmarkEnd w:id="10"/>
+      <w:bookmarkEnd w:id="11"/>
       <w:r>
         <w:t>,</w:t>
       </w:r>
@@ -1664,7 +1691,7 @@
     <w:p>
       <w:pPr>
         <w:sectPr>
-          <w:headerReference w:type="default" r:id="rId12"/>
+          <w:headerReference w:type="default" r:id="rId14"/>
           <w:type w:val="continuous"/>
           <w:pgSz w:w="11906" w:h="16838" w:code="9"/>
           <w:pgMar w:top="1134" w:right="1134" w:bottom="567" w:left="1418" w:header="709" w:footer="709" w:gutter="0"/>
@@ -1733,7 +1760,21 @@
         <w:rPr>
           <w:bCs/>
         </w:rPr>
-        <w:t xml:space="preserve">[U:ARTIKEL] sich vom </w:t>
+        <w:t>[</w:t>
+      </w:r>
+      <w:proofErr w:type="gramStart"/>
+      <w:r>
+        <w:rPr>
+          <w:bCs/>
+        </w:rPr>
+        <w:t>U:ARTIKEL</w:t>
+      </w:r>
+      <w:proofErr w:type="gramEnd"/>
+      <w:r>
+        <w:rPr>
+          <w:bCs/>
+        </w:rPr>
+        <w:t xml:space="preserve">] sich vom </w:t>
       </w:r>
       <w:r>
         <w:t>[NBEW-BWIDT] bis [U:ENTL-BWIDT]</w:t>
@@ -1756,8 +1797,13 @@
       <w:pPr>
         <w:pStyle w:val="berschrift1"/>
       </w:pPr>
-      <w:r>
-        <w:t>Diagnosen:</w:t>
+      <w:proofErr w:type="spellStart"/>
+      <w:r>
+        <w:t>Diagnosen</w:t>
+      </w:r>
+      <w:proofErr w:type="spellEnd"/>
+      <w:r>
+        <w:t>:</w:t>
       </w:r>
     </w:p>
     <w:p>
@@ -1765,7 +1811,15 @@
         <w:pStyle w:val="Diagnose"/>
       </w:pPr>
       <w:r>
-        <w:t>[USER:DIATAB-DIA_DKEY]</w:t>
+        <w:t>[</w:t>
+      </w:r>
+      <w:proofErr w:type="gramStart"/>
+      <w:r>
+        <w:t>USER:DIATAB</w:t>
+      </w:r>
+      <w:proofErr w:type="gramEnd"/>
+      <w:r>
+        <w:t>-DIA_DKEY]</w:t>
       </w:r>
       <w:r>
         <w:tab/>
@@ -1782,8 +1836,29 @@
       <w:pPr>
         <w:pStyle w:val="berschrift1"/>
       </w:pPr>
-      <w:r>
-        <w:t>Therapie und Prozeduren im PKH</w:t>
+      <w:proofErr w:type="spellStart"/>
+      <w:r>
+        <w:t>Therapie</w:t>
+      </w:r>
+      <w:proofErr w:type="spellEnd"/>
+      <w:r>
+        <w:t xml:space="preserve"> und </w:t>
+      </w:r>
+      <w:proofErr w:type="spellStart"/>
+      <w:r>
+        <w:t>Prozeduren</w:t>
+      </w:r>
+      <w:proofErr w:type="spellEnd"/>
+      <w:r>
+        <w:t xml:space="preserve"> </w:t>
+      </w:r>
+      <w:proofErr w:type="spellStart"/>
+      <w:r>
+        <w:t>im</w:t>
+      </w:r>
+      <w:proofErr w:type="spellEnd"/>
+      <w:r>
+        <w:t xml:space="preserve"> PKH</w:t>
       </w:r>
       <w:r>
         <w:t>:</w:t>
@@ -1794,7 +1869,15 @@
         <w:pStyle w:val="Diagnose"/>
       </w:pPr>
       <w:r>
-        <w:t>[USER:PROCTAB-</w:t>
+        <w:t>[</w:t>
+      </w:r>
+      <w:proofErr w:type="gramStart"/>
+      <w:r>
+        <w:t>USER:PROCTAB</w:t>
+      </w:r>
+      <w:proofErr w:type="gramEnd"/>
+      <w:r>
+        <w:t>-</w:t>
       </w:r>
       <w:r>
         <w:t>PROC_</w:t>
@@ -1814,159 +1897,169 @@
       <w:pPr>
         <w:pStyle w:val="berschrift1"/>
       </w:pPr>
-      <w:r>
-        <w:t>Therapie:</w:t>
+      <w:proofErr w:type="spellStart"/>
+      <w:r>
+        <w:t>Therapie</w:t>
+      </w:r>
+      <w:proofErr w:type="spellEnd"/>
+      <w:r>
+        <w:t>:</w:t>
       </w:r>
     </w:p>
     <w:p>
       <w:r>
         <w:t xml:space="preserve"> </w:t>
       </w:r>
-      <w:bookmarkStart w:id="11" w:name="Anamnese"/>
-      <w:bookmarkEnd w:id="11"/>
+      <w:bookmarkStart w:id="12" w:name="Anamnese"/>
+      <w:bookmarkEnd w:id="12"/>
       <w:r>
         <w:t xml:space="preserve"> </w:t>
       </w:r>
-      <w:bookmarkStart w:id="12" w:name="Opbericht"/>
-      <w:bookmarkEnd w:id="12"/>
+      <w:bookmarkStart w:id="13" w:name="Opbericht"/>
+      <w:bookmarkEnd w:id="13"/>
       <w:r>
         <w:t xml:space="preserve"> </w:t>
       </w:r>
-      <w:bookmarkStart w:id="13" w:name="koerper"/>
-      <w:bookmarkEnd w:id="13"/>
+      <w:bookmarkStart w:id="14" w:name="koerper"/>
+      <w:bookmarkEnd w:id="14"/>
       <w:r>
         <w:t xml:space="preserve"> </w:t>
       </w:r>
-      <w:bookmarkStart w:id="14" w:name="ROE"/>
-      <w:bookmarkEnd w:id="14"/>
+      <w:bookmarkStart w:id="15" w:name="ROE"/>
+      <w:bookmarkEnd w:id="15"/>
       <w:r>
         <w:t xml:space="preserve"> </w:t>
       </w:r>
-      <w:bookmarkStart w:id="15" w:name="EKG"/>
-      <w:bookmarkEnd w:id="15"/>
+      <w:bookmarkStart w:id="16" w:name="EKG"/>
+      <w:bookmarkEnd w:id="16"/>
       <w:r>
         <w:t xml:space="preserve"> </w:t>
       </w:r>
-      <w:bookmarkStart w:id="16" w:name="Ekgbelast"/>
-      <w:bookmarkStart w:id="17" w:name="LangzRR"/>
-      <w:bookmarkEnd w:id="16"/>
+      <w:bookmarkStart w:id="17" w:name="Ekgbelast"/>
+      <w:bookmarkStart w:id="18" w:name="LangzRR"/>
       <w:bookmarkEnd w:id="17"/>
+      <w:bookmarkEnd w:id="18"/>
       <w:r>
         <w:t xml:space="preserve"> </w:t>
       </w:r>
-      <w:bookmarkStart w:id="18" w:name="Ekglangzeit"/>
-      <w:bookmarkEnd w:id="18"/>
+      <w:bookmarkStart w:id="19" w:name="Ekglangzeit"/>
+      <w:bookmarkEnd w:id="19"/>
       <w:r>
         <w:t xml:space="preserve"> </w:t>
       </w:r>
-      <w:bookmarkStart w:id="19" w:name="Echokard"/>
-      <w:bookmarkEnd w:id="19"/>
+      <w:bookmarkStart w:id="20" w:name="Echokard"/>
+      <w:bookmarkEnd w:id="20"/>
       <w:r>
         <w:t xml:space="preserve"> </w:t>
       </w:r>
-      <w:bookmarkStart w:id="20" w:name="Sonobauch"/>
-      <w:bookmarkEnd w:id="20"/>
+      <w:bookmarkStart w:id="21" w:name="Sonobauch"/>
+      <w:bookmarkEnd w:id="21"/>
       <w:r>
         <w:t xml:space="preserve"> </w:t>
       </w:r>
-      <w:bookmarkStart w:id="21" w:name="Sonosd"/>
-      <w:bookmarkEnd w:id="21"/>
+      <w:bookmarkStart w:id="22" w:name="Sonosd"/>
+      <w:bookmarkEnd w:id="22"/>
       <w:r>
         <w:t xml:space="preserve"> </w:t>
       </w:r>
-      <w:bookmarkStart w:id="22" w:name="Sonogef"/>
-      <w:bookmarkEnd w:id="22"/>
+      <w:bookmarkStart w:id="23" w:name="Sonogef"/>
+      <w:bookmarkEnd w:id="23"/>
       <w:r>
         <w:t xml:space="preserve"> </w:t>
       </w:r>
-      <w:bookmarkStart w:id="23" w:name="Sonograf"/>
-      <w:bookmarkEnd w:id="23"/>
+      <w:bookmarkStart w:id="24" w:name="Sonograf"/>
+      <w:bookmarkEnd w:id="24"/>
       <w:r>
         <w:t xml:space="preserve"> </w:t>
       </w:r>
-      <w:bookmarkStart w:id="24" w:name="Gynkonsil"/>
-      <w:bookmarkStart w:id="25" w:name="Schrittmacher"/>
-      <w:bookmarkEnd w:id="24"/>
+      <w:bookmarkStart w:id="25" w:name="Gynkonsil"/>
+      <w:bookmarkStart w:id="26" w:name="Schrittmacher"/>
       <w:bookmarkEnd w:id="25"/>
+      <w:bookmarkEnd w:id="26"/>
       <w:r>
         <w:t xml:space="preserve"> </w:t>
       </w:r>
-      <w:bookmarkStart w:id="26" w:name="Chikonsil"/>
-      <w:bookmarkEnd w:id="26"/>
+      <w:bookmarkStart w:id="27" w:name="Chikonsil"/>
+      <w:bookmarkEnd w:id="27"/>
       <w:r>
         <w:t xml:space="preserve"> </w:t>
       </w:r>
-      <w:bookmarkStart w:id="27" w:name="Sonstkonsil"/>
-      <w:bookmarkEnd w:id="27"/>
+      <w:bookmarkStart w:id="28" w:name="Sonstkonsil"/>
+      <w:bookmarkEnd w:id="28"/>
       <w:r>
         <w:t xml:space="preserve"> </w:t>
       </w:r>
-      <w:bookmarkStart w:id="28" w:name="Hnokonsil"/>
-      <w:bookmarkEnd w:id="28"/>
+      <w:bookmarkStart w:id="29" w:name="Hnokonsil"/>
+      <w:bookmarkEnd w:id="29"/>
       <w:r>
         <w:t xml:space="preserve"> </w:t>
       </w:r>
-      <w:bookmarkStart w:id="29" w:name="Neukonsil"/>
-      <w:bookmarkEnd w:id="29"/>
+      <w:bookmarkStart w:id="30" w:name="Neukonsil"/>
+      <w:bookmarkEnd w:id="30"/>
       <w:r>
         <w:t xml:space="preserve"> </w:t>
       </w:r>
-      <w:bookmarkStart w:id="30" w:name="Urokonsil"/>
-      <w:bookmarkEnd w:id="30"/>
+      <w:bookmarkStart w:id="31" w:name="Urokonsil"/>
+      <w:bookmarkEnd w:id="31"/>
       <w:r>
         <w:t xml:space="preserve"> </w:t>
       </w:r>
-      <w:bookmarkStart w:id="31" w:name="Derkonsil"/>
-      <w:bookmarkEnd w:id="31"/>
+      <w:bookmarkStart w:id="32" w:name="Derkonsil"/>
+      <w:bookmarkEnd w:id="32"/>
       <w:r>
         <w:t xml:space="preserve"> </w:t>
       </w:r>
-      <w:bookmarkStart w:id="32" w:name="Augkonsil"/>
-      <w:bookmarkEnd w:id="32"/>
+      <w:bookmarkStart w:id="33" w:name="Augkonsil"/>
+      <w:bookmarkEnd w:id="33"/>
       <w:r>
         <w:t xml:space="preserve"> </w:t>
       </w:r>
-      <w:bookmarkStart w:id="33" w:name="Zahkonsil"/>
-      <w:bookmarkStart w:id="34" w:name="Endo"/>
-      <w:bookmarkStart w:id="35" w:name="Diaet"/>
-      <w:bookmarkEnd w:id="33"/>
+      <w:bookmarkStart w:id="34" w:name="Zahkonsil"/>
+      <w:bookmarkStart w:id="35" w:name="Endo"/>
+      <w:bookmarkStart w:id="36" w:name="Diaet"/>
       <w:bookmarkEnd w:id="34"/>
       <w:bookmarkEnd w:id="35"/>
+      <w:bookmarkEnd w:id="36"/>
       <w:r>
         <w:t xml:space="preserve"> </w:t>
       </w:r>
-      <w:bookmarkStart w:id="36" w:name="Lufu"/>
-      <w:bookmarkStart w:id="37" w:name="Dialyse"/>
-      <w:bookmarkStart w:id="38" w:name="Rechtsherz"/>
-      <w:bookmarkStart w:id="39" w:name="Gehtest"/>
-      <w:bookmarkStart w:id="40" w:name="MibiErregerHinweis"/>
-      <w:bookmarkStart w:id="41" w:name="Karotidendoppler"/>
-      <w:bookmarkStart w:id="42" w:name="Knochenmarkbiopsie"/>
-      <w:bookmarkEnd w:id="36"/>
+      <w:bookmarkStart w:id="37" w:name="Lufu"/>
+      <w:bookmarkStart w:id="38" w:name="Dialyse"/>
+      <w:bookmarkStart w:id="39" w:name="Rechtsherz"/>
+      <w:bookmarkStart w:id="40" w:name="Gehtest"/>
+      <w:bookmarkStart w:id="41" w:name="MibiErregerHinweis"/>
+      <w:bookmarkStart w:id="42" w:name="Karotidendoppler"/>
+      <w:bookmarkStart w:id="43" w:name="Knochenmarkbiopsie"/>
       <w:bookmarkEnd w:id="37"/>
       <w:bookmarkEnd w:id="38"/>
       <w:bookmarkEnd w:id="39"/>
       <w:bookmarkEnd w:id="40"/>
       <w:bookmarkEnd w:id="41"/>
       <w:bookmarkEnd w:id="42"/>
+      <w:bookmarkEnd w:id="43"/>
     </w:p>
     <w:p/>
     <w:p>
       <w:pPr>
         <w:pStyle w:val="berschrift1"/>
       </w:pPr>
+      <w:proofErr w:type="spellStart"/>
       <w:r>
         <w:t>Labor</w:t>
       </w:r>
-      <w:bookmarkStart w:id="43" w:name="LaborStart"/>
-      <w:bookmarkEnd w:id="43"/>
-      <w:r>
-        <w:t>parameter:</w:t>
+      <w:bookmarkStart w:id="44" w:name="LaborStart"/>
+      <w:bookmarkEnd w:id="44"/>
+      <w:r>
+        <w:t>parameter</w:t>
+      </w:r>
+      <w:proofErr w:type="spellEnd"/>
+      <w:r>
+        <w:t>:</w:t>
       </w:r>
     </w:p>
     <w:p>
-      <w:bookmarkStart w:id="44" w:name="Labor"/>
-      <w:bookmarkEnd w:id="44"/>
+      <w:bookmarkStart w:id="45" w:name="Labor"/>
+      <w:bookmarkEnd w:id="45"/>
     </w:p>
     <w:p/>
     <w:p>
@@ -1995,37 +2088,55 @@
       </w:r>
     </w:p>
     <w:p>
-      <w:bookmarkStart w:id="45" w:name="OPBerichtPMD"/>
-      <w:bookmarkEnd w:id="45"/>
+      <w:bookmarkStart w:id="46" w:name="OPBerichtPMD"/>
+      <w:bookmarkEnd w:id="46"/>
     </w:p>
     <w:p>
       <w:pPr>
         <w:pStyle w:val="berschrift1"/>
       </w:pPr>
-      <w:r>
-        <w:t>Blutgruppe und Transfusionen:</w:t>
+      <w:proofErr w:type="spellStart"/>
+      <w:r>
+        <w:t>Blutgruppe</w:t>
+      </w:r>
+      <w:proofErr w:type="spellEnd"/>
+      <w:r>
+        <w:t xml:space="preserve"> und </w:t>
+      </w:r>
+      <w:proofErr w:type="spellStart"/>
+      <w:r>
+        <w:t>Transfusionen</w:t>
+      </w:r>
+      <w:proofErr w:type="spellEnd"/>
+      <w:r>
+        <w:t>:</w:t>
       </w:r>
     </w:p>
     <w:p>
-      <w:bookmarkStart w:id="46" w:name="Blutprodukte"/>
-      <w:bookmarkEnd w:id="46"/>
+      <w:bookmarkStart w:id="47" w:name="Blutprodukte"/>
+      <w:bookmarkEnd w:id="47"/>
     </w:p>
     <w:p/>
     <w:p>
       <w:pPr>
         <w:pStyle w:val="berschrift1"/>
       </w:pPr>
-      <w:bookmarkStart w:id="47" w:name="Antibiotika"/>
-      <w:bookmarkStart w:id="48" w:name="Blutkomp"/>
-      <w:bookmarkEnd w:id="47"/>
+      <w:bookmarkStart w:id="48" w:name="Antibiotika"/>
+      <w:bookmarkStart w:id="49" w:name="Blutkomp"/>
       <w:bookmarkEnd w:id="48"/>
-      <w:r>
-        <w:t>Medikation:</w:t>
+      <w:bookmarkEnd w:id="49"/>
+      <w:proofErr w:type="spellStart"/>
+      <w:r>
+        <w:t>Medikation</w:t>
+      </w:r>
+      <w:proofErr w:type="spellEnd"/>
+      <w:r>
+        <w:t>:</w:t>
       </w:r>
     </w:p>
     <w:p>
-      <w:bookmarkStart w:id="49" w:name="StandMedikation"/>
-      <w:bookmarkEnd w:id="49"/>
+      <w:bookmarkStart w:id="50" w:name="StandMedikation"/>
+      <w:bookmarkEnd w:id="50"/>
     </w:p>
     <w:tbl>
       <w:tblPr>
@@ -2145,12 +2256,21 @@
                 <w:szCs w:val="18"/>
               </w:rPr>
             </w:pPr>
+            <w:proofErr w:type="spellStart"/>
             <w:r>
               <w:rPr>
                 <w:sz w:val="18"/>
                 <w:szCs w:val="18"/>
               </w:rPr>
-              <w:t>Appl.</w:t>
+              <w:t>Appl</w:t>
+            </w:r>
+            <w:proofErr w:type="spellEnd"/>
+            <w:r>
+              <w:rPr>
+                <w:sz w:val="18"/>
+                <w:szCs w:val="18"/>
+              </w:rPr>
+              <w:t>.</w:t>
             </w:r>
           </w:p>
         </w:tc>
@@ -2175,7 +2295,23 @@
                 <w:sz w:val="18"/>
                 <w:szCs w:val="18"/>
               </w:rPr>
-              <w:t>Dar.-einh.</w:t>
+              <w:t>Dar.-</w:t>
+            </w:r>
+            <w:proofErr w:type="spellStart"/>
+            <w:r>
+              <w:rPr>
+                <w:sz w:val="18"/>
+                <w:szCs w:val="18"/>
+              </w:rPr>
+              <w:t>einh</w:t>
+            </w:r>
+            <w:proofErr w:type="spellEnd"/>
+            <w:r>
+              <w:rPr>
+                <w:sz w:val="18"/>
+                <w:szCs w:val="18"/>
+              </w:rPr>
+              <w:t>.</w:t>
             </w:r>
           </w:p>
         </w:tc>
@@ -2287,8 +2423,8 @@
             <w:shd w:val="clear" w:color="auto" w:fill="auto"/>
           </w:tcPr>
           <w:p>
-            <w:bookmarkStart w:id="50" w:name="MEDIKAMENT"/>
-            <w:bookmarkEnd w:id="50"/>
+            <w:bookmarkStart w:id="51" w:name="MEDIKAMENT"/>
+            <w:bookmarkEnd w:id="51"/>
           </w:p>
         </w:tc>
         <w:tc>
@@ -2378,12 +2514,12 @@
       </w:tr>
     </w:tbl>
     <w:p>
-      <w:bookmarkStart w:id="51" w:name="MEDIKA_TEXT"/>
-      <w:bookmarkEnd w:id="51"/>
+      <w:bookmarkStart w:id="52" w:name="MEDIKA_TEXT"/>
+      <w:bookmarkEnd w:id="52"/>
     </w:p>
     <w:p>
-      <w:bookmarkStart w:id="52" w:name="Epikrise"/>
-      <w:bookmarkEnd w:id="52"/>
+      <w:bookmarkStart w:id="53" w:name="Epikrise"/>
+      <w:bookmarkEnd w:id="53"/>
       <w:r>
         <w:t>Wir danken Ihnen für die Überweisung des Patienten und verbleiben</w:t>
       </w:r>
@@ -2435,9 +2571,11 @@
       <w:r>
         <w:t xml:space="preserve">PD Dr. J. </w:t>
       </w:r>
+      <w:proofErr w:type="spellStart"/>
       <w:r>
         <w:t>Knierim</w:t>
       </w:r>
+      <w:proofErr w:type="spellEnd"/>
       <w:r>
         <w:tab/>
         <w:t>OA</w:t>
@@ -2446,15 +2584,15 @@
         <w:tab/>
         <w:t>Stationsarzt</w:t>
       </w:r>
-      <w:bookmarkStart w:id="53" w:name="Unterschrift"/>
-      <w:bookmarkEnd w:id="53"/>
+      <w:bookmarkStart w:id="54" w:name="Unterschrift"/>
+      <w:bookmarkEnd w:id="54"/>
     </w:p>
     <w:p>
       <w:pPr>
         <w:pStyle w:val="berschrift1"/>
       </w:pPr>
-      <w:bookmarkStart w:id="54" w:name="MibiErregerTabelle1"/>
-      <w:bookmarkEnd w:id="54"/>
+      <w:bookmarkStart w:id="55" w:name="MibiErregerTabelle1"/>
+      <w:bookmarkEnd w:id="55"/>
     </w:p>
     <w:tbl>
       <w:tblPr>
@@ -2608,7 +2746,23 @@
                 <w:sz w:val="18"/>
                 <w:szCs w:val="18"/>
               </w:rPr>
-              <w:t>Erregertext (Keimzahl)</w:t>
+              <w:t>Erregertext (</w:t>
+            </w:r>
+            <w:proofErr w:type="spellStart"/>
+            <w:r>
+              <w:rPr>
+                <w:sz w:val="18"/>
+                <w:szCs w:val="18"/>
+              </w:rPr>
+              <w:t>Keimzahl</w:t>
+            </w:r>
+            <w:proofErr w:type="spellEnd"/>
+            <w:r>
+              <w:rPr>
+                <w:sz w:val="18"/>
+                <w:szCs w:val="18"/>
+              </w:rPr>
+              <w:t>)</w:t>
             </w:r>
           </w:p>
         </w:tc>
@@ -2713,8 +2867,17 @@
                 <w:sz w:val="14"/>
                 <w:szCs w:val="14"/>
               </w:rPr>
-              <w:t>- Oxacillin</w:t>
-            </w:r>
+              <w:t xml:space="preserve">- </w:t>
+            </w:r>
+            <w:proofErr w:type="spellStart"/>
+            <w:r>
+              <w:rPr>
+                <w:sz w:val="14"/>
+                <w:szCs w:val="14"/>
+              </w:rPr>
+              <w:t>Oxacillin</w:t>
+            </w:r>
+            <w:proofErr w:type="spellEnd"/>
           </w:p>
         </w:tc>
         <w:tc>
@@ -2742,8 +2905,17 @@
                 <w:sz w:val="14"/>
                 <w:szCs w:val="14"/>
               </w:rPr>
-              <w:t>- Amicillin</w:t>
-            </w:r>
+              <w:t xml:space="preserve">- </w:t>
+            </w:r>
+            <w:proofErr w:type="spellStart"/>
+            <w:r>
+              <w:rPr>
+                <w:sz w:val="14"/>
+                <w:szCs w:val="14"/>
+              </w:rPr>
+              <w:t>Amicillin</w:t>
+            </w:r>
+            <w:proofErr w:type="spellEnd"/>
           </w:p>
         </w:tc>
         <w:tc>
@@ -2771,8 +2943,33 @@
                 <w:sz w:val="14"/>
                 <w:szCs w:val="14"/>
               </w:rPr>
-              <w:t>- Ampicillin/Sulbactam</w:t>
-            </w:r>
+              <w:t xml:space="preserve">- </w:t>
+            </w:r>
+            <w:proofErr w:type="spellStart"/>
+            <w:r>
+              <w:rPr>
+                <w:sz w:val="14"/>
+                <w:szCs w:val="14"/>
+              </w:rPr>
+              <w:t>Ampicillin</w:t>
+            </w:r>
+            <w:proofErr w:type="spellEnd"/>
+            <w:r>
+              <w:rPr>
+                <w:sz w:val="14"/>
+                <w:szCs w:val="14"/>
+              </w:rPr>
+              <w:t>/</w:t>
+            </w:r>
+            <w:proofErr w:type="spellStart"/>
+            <w:r>
+              <w:rPr>
+                <w:sz w:val="14"/>
+                <w:szCs w:val="14"/>
+              </w:rPr>
+              <w:t>Sulbactam</w:t>
+            </w:r>
+            <w:proofErr w:type="spellEnd"/>
           </w:p>
         </w:tc>
         <w:tc>
@@ -2800,8 +2997,17 @@
                 <w:sz w:val="14"/>
                 <w:szCs w:val="14"/>
               </w:rPr>
-              <w:t>- Piperacillin</w:t>
-            </w:r>
+              <w:t xml:space="preserve">- </w:t>
+            </w:r>
+            <w:proofErr w:type="spellStart"/>
+            <w:r>
+              <w:rPr>
+                <w:sz w:val="14"/>
+                <w:szCs w:val="14"/>
+              </w:rPr>
+              <w:t>Piperacillin</w:t>
+            </w:r>
+            <w:proofErr w:type="spellEnd"/>
           </w:p>
         </w:tc>
         <w:tc>
@@ -2829,8 +3035,33 @@
                 <w:sz w:val="14"/>
                 <w:szCs w:val="14"/>
               </w:rPr>
-              <w:t>- Piperacillin/Tazobactam</w:t>
-            </w:r>
+              <w:t xml:space="preserve">- </w:t>
+            </w:r>
+            <w:proofErr w:type="spellStart"/>
+            <w:r>
+              <w:rPr>
+                <w:sz w:val="14"/>
+                <w:szCs w:val="14"/>
+              </w:rPr>
+              <w:t>Piperacillin</w:t>
+            </w:r>
+            <w:proofErr w:type="spellEnd"/>
+            <w:r>
+              <w:rPr>
+                <w:sz w:val="14"/>
+                <w:szCs w:val="14"/>
+              </w:rPr>
+              <w:t>/</w:t>
+            </w:r>
+            <w:proofErr w:type="spellStart"/>
+            <w:r>
+              <w:rPr>
+                <w:sz w:val="14"/>
+                <w:szCs w:val="14"/>
+              </w:rPr>
+              <w:t>Tazobactam</w:t>
+            </w:r>
+            <w:proofErr w:type="spellEnd"/>
           </w:p>
         </w:tc>
         <w:tc>
@@ -2858,7 +3089,23 @@
                 <w:sz w:val="14"/>
                 <w:szCs w:val="14"/>
               </w:rPr>
-              <w:t>- Cefazolin (Gr. 1)</w:t>
+              <w:t xml:space="preserve">- </w:t>
+            </w:r>
+            <w:proofErr w:type="spellStart"/>
+            <w:r>
+              <w:rPr>
+                <w:sz w:val="14"/>
+                <w:szCs w:val="14"/>
+              </w:rPr>
+              <w:t>Cefazolin</w:t>
+            </w:r>
+            <w:proofErr w:type="spellEnd"/>
+            <w:r>
+              <w:rPr>
+                <w:sz w:val="14"/>
+                <w:szCs w:val="14"/>
+              </w:rPr>
+              <w:t xml:space="preserve"> (Gr. 1)</w:t>
             </w:r>
           </w:p>
         </w:tc>
@@ -2887,7 +3134,23 @@
                 <w:sz w:val="14"/>
                 <w:szCs w:val="14"/>
               </w:rPr>
-              <w:t>- Cefaclor (Oral Gr. 1)</w:t>
+              <w:t xml:space="preserve">- </w:t>
+            </w:r>
+            <w:proofErr w:type="spellStart"/>
+            <w:r>
+              <w:rPr>
+                <w:sz w:val="14"/>
+                <w:szCs w:val="14"/>
+              </w:rPr>
+              <w:t>Cefaclor</w:t>
+            </w:r>
+            <w:proofErr w:type="spellEnd"/>
+            <w:r>
+              <w:rPr>
+                <w:sz w:val="14"/>
+                <w:szCs w:val="14"/>
+              </w:rPr>
+              <w:t xml:space="preserve"> (Oral Gr. 1)</w:t>
             </w:r>
           </w:p>
         </w:tc>
@@ -2916,7 +3179,23 @@
                 <w:sz w:val="14"/>
                 <w:szCs w:val="14"/>
               </w:rPr>
-              <w:t>- Cefalexin (Oral Gr.  1)</w:t>
+              <w:t xml:space="preserve">- </w:t>
+            </w:r>
+            <w:proofErr w:type="spellStart"/>
+            <w:r>
+              <w:rPr>
+                <w:sz w:val="14"/>
+                <w:szCs w:val="14"/>
+              </w:rPr>
+              <w:t>Cefalexin</w:t>
+            </w:r>
+            <w:proofErr w:type="spellEnd"/>
+            <w:r>
+              <w:rPr>
+                <w:sz w:val="14"/>
+                <w:szCs w:val="14"/>
+              </w:rPr>
+              <w:t xml:space="preserve"> (Oral Gr.  1)</w:t>
             </w:r>
           </w:p>
         </w:tc>
@@ -2945,7 +3224,23 @@
                 <w:sz w:val="14"/>
                 <w:szCs w:val="14"/>
               </w:rPr>
-              <w:t>- Cefuroxim (Oral/PE Gr. 2)</w:t>
+              <w:t xml:space="preserve">- </w:t>
+            </w:r>
+            <w:proofErr w:type="spellStart"/>
+            <w:r>
+              <w:rPr>
+                <w:sz w:val="14"/>
+                <w:szCs w:val="14"/>
+              </w:rPr>
+              <w:t>Cefuroxim</w:t>
+            </w:r>
+            <w:proofErr w:type="spellEnd"/>
+            <w:r>
+              <w:rPr>
+                <w:sz w:val="14"/>
+                <w:szCs w:val="14"/>
+              </w:rPr>
+              <w:t xml:space="preserve"> (Oral/PE Gr. 2)</w:t>
             </w:r>
           </w:p>
         </w:tc>
@@ -2974,7 +3269,23 @@
                 <w:sz w:val="14"/>
                 <w:szCs w:val="14"/>
               </w:rPr>
-              <w:t>- Cefotiam (Gr. 2)</w:t>
+              <w:t xml:space="preserve">- </w:t>
+            </w:r>
+            <w:proofErr w:type="spellStart"/>
+            <w:r>
+              <w:rPr>
+                <w:sz w:val="14"/>
+                <w:szCs w:val="14"/>
+              </w:rPr>
+              <w:t>Cefotiam</w:t>
+            </w:r>
+            <w:proofErr w:type="spellEnd"/>
+            <w:r>
+              <w:rPr>
+                <w:sz w:val="14"/>
+                <w:szCs w:val="14"/>
+              </w:rPr>
+              <w:t xml:space="preserve"> (Gr. 2)</w:t>
             </w:r>
           </w:p>
         </w:tc>
@@ -3003,7 +3314,23 @@
                 <w:sz w:val="14"/>
                 <w:szCs w:val="14"/>
               </w:rPr>
-              <w:t>- Cefixim (Oral Gr. 3)</w:t>
+              <w:t xml:space="preserve">- </w:t>
+            </w:r>
+            <w:proofErr w:type="spellStart"/>
+            <w:r>
+              <w:rPr>
+                <w:sz w:val="14"/>
+                <w:szCs w:val="14"/>
+              </w:rPr>
+              <w:t>Cefixim</w:t>
+            </w:r>
+            <w:proofErr w:type="spellEnd"/>
+            <w:r>
+              <w:rPr>
+                <w:sz w:val="14"/>
+                <w:szCs w:val="14"/>
+              </w:rPr>
+              <w:t xml:space="preserve"> (Oral Gr. 3)</w:t>
             </w:r>
           </w:p>
         </w:tc>
@@ -3032,7 +3359,23 @@
                 <w:sz w:val="14"/>
                 <w:szCs w:val="14"/>
               </w:rPr>
-              <w:t>- Cefotaxim (Gr. 3a)</w:t>
+              <w:t xml:space="preserve">- </w:t>
+            </w:r>
+            <w:proofErr w:type="spellStart"/>
+            <w:r>
+              <w:rPr>
+                <w:sz w:val="14"/>
+                <w:szCs w:val="14"/>
+              </w:rPr>
+              <w:t>Cefotaxim</w:t>
+            </w:r>
+            <w:proofErr w:type="spellEnd"/>
+            <w:r>
+              <w:rPr>
+                <w:sz w:val="14"/>
+                <w:szCs w:val="14"/>
+              </w:rPr>
+              <w:t xml:space="preserve"> (Gr. 3a)</w:t>
             </w:r>
           </w:p>
         </w:tc>
@@ -3061,7 +3404,23 @@
                 <w:sz w:val="14"/>
                 <w:szCs w:val="14"/>
               </w:rPr>
-              <w:t>- Ceftriaxon (Gr. 3a)</w:t>
+              <w:t xml:space="preserve">- </w:t>
+            </w:r>
+            <w:proofErr w:type="spellStart"/>
+            <w:r>
+              <w:rPr>
+                <w:sz w:val="14"/>
+                <w:szCs w:val="14"/>
+              </w:rPr>
+              <w:t>Ceftriaxon</w:t>
+            </w:r>
+            <w:proofErr w:type="spellEnd"/>
+            <w:r>
+              <w:rPr>
+                <w:sz w:val="14"/>
+                <w:szCs w:val="14"/>
+              </w:rPr>
+              <w:t xml:space="preserve"> (Gr. 3a)</w:t>
             </w:r>
           </w:p>
         </w:tc>
@@ -3090,7 +3449,23 @@
                 <w:sz w:val="14"/>
                 <w:szCs w:val="14"/>
               </w:rPr>
-              <w:t>- Ceftazidim (Gr. 3b)</w:t>
+              <w:t xml:space="preserve">- </w:t>
+            </w:r>
+            <w:proofErr w:type="spellStart"/>
+            <w:r>
+              <w:rPr>
+                <w:sz w:val="14"/>
+                <w:szCs w:val="14"/>
+              </w:rPr>
+              <w:t>Ceftazidim</w:t>
+            </w:r>
+            <w:proofErr w:type="spellEnd"/>
+            <w:r>
+              <w:rPr>
+                <w:sz w:val="14"/>
+                <w:szCs w:val="14"/>
+              </w:rPr>
+              <w:t xml:space="preserve"> (Gr. 3b)</w:t>
             </w:r>
           </w:p>
         </w:tc>
@@ -3119,8 +3494,17 @@
                 <w:sz w:val="14"/>
                 <w:szCs w:val="14"/>
               </w:rPr>
-              <w:t>- Imipenem</w:t>
-            </w:r>
+              <w:t xml:space="preserve">- </w:t>
+            </w:r>
+            <w:proofErr w:type="spellStart"/>
+            <w:r>
+              <w:rPr>
+                <w:sz w:val="14"/>
+                <w:szCs w:val="14"/>
+              </w:rPr>
+              <w:t>Imipenem</w:t>
+            </w:r>
+            <w:proofErr w:type="spellEnd"/>
           </w:p>
         </w:tc>
         <w:tc>
@@ -3148,8 +3532,17 @@
                 <w:sz w:val="14"/>
                 <w:szCs w:val="14"/>
               </w:rPr>
-              <w:t>- Meropenem</w:t>
-            </w:r>
+              <w:t xml:space="preserve">- </w:t>
+            </w:r>
+            <w:proofErr w:type="spellStart"/>
+            <w:r>
+              <w:rPr>
+                <w:sz w:val="14"/>
+                <w:szCs w:val="14"/>
+              </w:rPr>
+              <w:t>Meropenem</w:t>
+            </w:r>
+            <w:proofErr w:type="spellEnd"/>
           </w:p>
         </w:tc>
         <w:tc>
@@ -3177,8 +3570,17 @@
                 <w:sz w:val="14"/>
                 <w:szCs w:val="14"/>
               </w:rPr>
-              <w:t>- Ciprofloxacin</w:t>
-            </w:r>
+              <w:t xml:space="preserve">- </w:t>
+            </w:r>
+            <w:proofErr w:type="spellStart"/>
+            <w:r>
+              <w:rPr>
+                <w:sz w:val="14"/>
+                <w:szCs w:val="14"/>
+              </w:rPr>
+              <w:t>Ciprofloxacin</w:t>
+            </w:r>
+            <w:proofErr w:type="spellEnd"/>
           </w:p>
         </w:tc>
         <w:tc>
@@ -3206,8 +3608,17 @@
                 <w:sz w:val="14"/>
                 <w:szCs w:val="14"/>
               </w:rPr>
-              <w:t>- Levofloxacin</w:t>
-            </w:r>
+              <w:t xml:space="preserve">- </w:t>
+            </w:r>
+            <w:proofErr w:type="spellStart"/>
+            <w:r>
+              <w:rPr>
+                <w:sz w:val="14"/>
+                <w:szCs w:val="14"/>
+              </w:rPr>
+              <w:t>Levofloxacin</w:t>
+            </w:r>
+            <w:proofErr w:type="spellEnd"/>
           </w:p>
         </w:tc>
         <w:tc>
@@ -3235,8 +3646,17 @@
                 <w:sz w:val="14"/>
                 <w:szCs w:val="14"/>
               </w:rPr>
-              <w:t>- Moxifloxacin</w:t>
-            </w:r>
+              <w:t xml:space="preserve">- </w:t>
+            </w:r>
+            <w:proofErr w:type="spellStart"/>
+            <w:r>
+              <w:rPr>
+                <w:sz w:val="14"/>
+                <w:szCs w:val="14"/>
+              </w:rPr>
+              <w:t>Moxifloxacin</w:t>
+            </w:r>
+            <w:proofErr w:type="spellEnd"/>
           </w:p>
         </w:tc>
         <w:tc>
@@ -3264,8 +3684,17 @@
                 <w:sz w:val="14"/>
                 <w:szCs w:val="14"/>
               </w:rPr>
-              <w:t>- Gentamycin</w:t>
-            </w:r>
+              <w:t xml:space="preserve">- </w:t>
+            </w:r>
+            <w:proofErr w:type="spellStart"/>
+            <w:r>
+              <w:rPr>
+                <w:sz w:val="14"/>
+                <w:szCs w:val="14"/>
+              </w:rPr>
+              <w:t>Gentamycin</w:t>
+            </w:r>
+            <w:proofErr w:type="spellEnd"/>
           </w:p>
         </w:tc>
         <w:tc>
@@ -3293,7 +3722,23 @@
                 <w:sz w:val="14"/>
                 <w:szCs w:val="14"/>
               </w:rPr>
-              <w:t>- Gentamycin (HR)</w:t>
+              <w:t xml:space="preserve">- </w:t>
+            </w:r>
+            <w:proofErr w:type="spellStart"/>
+            <w:r>
+              <w:rPr>
+                <w:sz w:val="14"/>
+                <w:szCs w:val="14"/>
+              </w:rPr>
+              <w:t>Gentamycin</w:t>
+            </w:r>
+            <w:proofErr w:type="spellEnd"/>
+            <w:r>
+              <w:rPr>
+                <w:sz w:val="14"/>
+                <w:szCs w:val="14"/>
+              </w:rPr>
+              <w:t xml:space="preserve"> (HR)</w:t>
             </w:r>
           </w:p>
         </w:tc>
@@ -3322,8 +3767,17 @@
                 <w:sz w:val="14"/>
                 <w:szCs w:val="14"/>
               </w:rPr>
-              <w:t>- Tobramycin</w:t>
-            </w:r>
+              <w:t xml:space="preserve">- </w:t>
+            </w:r>
+            <w:proofErr w:type="spellStart"/>
+            <w:r>
+              <w:rPr>
+                <w:sz w:val="14"/>
+                <w:szCs w:val="14"/>
+              </w:rPr>
+              <w:t>Tobramycin</w:t>
+            </w:r>
+            <w:proofErr w:type="spellEnd"/>
           </w:p>
         </w:tc>
         <w:tc>
@@ -3351,8 +3805,17 @@
                 <w:sz w:val="14"/>
                 <w:szCs w:val="14"/>
               </w:rPr>
-              <w:t>- Amikacin</w:t>
-            </w:r>
+              <w:t xml:space="preserve">- </w:t>
+            </w:r>
+            <w:proofErr w:type="spellStart"/>
+            <w:r>
+              <w:rPr>
+                <w:sz w:val="14"/>
+                <w:szCs w:val="14"/>
+              </w:rPr>
+              <w:t>Amikacin</w:t>
+            </w:r>
+            <w:proofErr w:type="spellEnd"/>
           </w:p>
         </w:tc>
         <w:tc>
@@ -3380,8 +3843,17 @@
                 <w:sz w:val="14"/>
                 <w:szCs w:val="14"/>
               </w:rPr>
-              <w:t>- Colistin</w:t>
-            </w:r>
+              <w:t xml:space="preserve">- </w:t>
+            </w:r>
+            <w:proofErr w:type="spellStart"/>
+            <w:r>
+              <w:rPr>
+                <w:sz w:val="14"/>
+                <w:szCs w:val="14"/>
+              </w:rPr>
+              <w:t>Colistin</w:t>
+            </w:r>
+            <w:proofErr w:type="spellEnd"/>
           </w:p>
         </w:tc>
         <w:tc>
@@ -3409,8 +3881,17 @@
                 <w:sz w:val="14"/>
                 <w:szCs w:val="14"/>
               </w:rPr>
-              <w:t>- Erythromycin</w:t>
-            </w:r>
+              <w:t xml:space="preserve">- </w:t>
+            </w:r>
+            <w:proofErr w:type="spellStart"/>
+            <w:r>
+              <w:rPr>
+                <w:sz w:val="14"/>
+                <w:szCs w:val="14"/>
+              </w:rPr>
+              <w:t>Erythromycin</w:t>
+            </w:r>
+            <w:proofErr w:type="spellEnd"/>
           </w:p>
         </w:tc>
         <w:tc>
@@ -3438,8 +3919,17 @@
                 <w:sz w:val="14"/>
                 <w:szCs w:val="14"/>
               </w:rPr>
-              <w:t>- Clarithromycin</w:t>
-            </w:r>
+              <w:t xml:space="preserve">- </w:t>
+            </w:r>
+            <w:proofErr w:type="spellStart"/>
+            <w:r>
+              <w:rPr>
+                <w:sz w:val="14"/>
+                <w:szCs w:val="14"/>
+              </w:rPr>
+              <w:t>Clarithromycin</w:t>
+            </w:r>
+            <w:proofErr w:type="spellEnd"/>
           </w:p>
         </w:tc>
         <w:tc>
@@ -3467,8 +3957,17 @@
                 <w:sz w:val="14"/>
                 <w:szCs w:val="14"/>
               </w:rPr>
-              <w:t>- Doxycyclin</w:t>
-            </w:r>
+              <w:t xml:space="preserve">- </w:t>
+            </w:r>
+            <w:proofErr w:type="spellStart"/>
+            <w:r>
+              <w:rPr>
+                <w:sz w:val="14"/>
+                <w:szCs w:val="14"/>
+              </w:rPr>
+              <w:t>Doxycyclin</w:t>
+            </w:r>
+            <w:proofErr w:type="spellEnd"/>
           </w:p>
         </w:tc>
         <w:tc>
@@ -3496,8 +3995,17 @@
                 <w:sz w:val="14"/>
                 <w:szCs w:val="14"/>
               </w:rPr>
-              <w:t>- Tetracyclin</w:t>
-            </w:r>
+              <w:t xml:space="preserve">- </w:t>
+            </w:r>
+            <w:proofErr w:type="spellStart"/>
+            <w:r>
+              <w:rPr>
+                <w:sz w:val="14"/>
+                <w:szCs w:val="14"/>
+              </w:rPr>
+              <w:t>Tetracyclin</w:t>
+            </w:r>
+            <w:proofErr w:type="spellEnd"/>
           </w:p>
         </w:tc>
         <w:tc>
@@ -3525,8 +4033,17 @@
                 <w:sz w:val="14"/>
                 <w:szCs w:val="14"/>
               </w:rPr>
-              <w:t>- Tigecyclin</w:t>
-            </w:r>
+              <w:t xml:space="preserve">- </w:t>
+            </w:r>
+            <w:proofErr w:type="spellStart"/>
+            <w:r>
+              <w:rPr>
+                <w:sz w:val="14"/>
+                <w:szCs w:val="14"/>
+              </w:rPr>
+              <w:t>Tigecyclin</w:t>
+            </w:r>
+            <w:proofErr w:type="spellEnd"/>
           </w:p>
         </w:tc>
         <w:tc>
@@ -3554,8 +4071,17 @@
                 <w:sz w:val="14"/>
                 <w:szCs w:val="14"/>
               </w:rPr>
-              <w:t>- Clindamycin</w:t>
-            </w:r>
+              <w:t xml:space="preserve">- </w:t>
+            </w:r>
+            <w:proofErr w:type="spellStart"/>
+            <w:r>
+              <w:rPr>
+                <w:sz w:val="14"/>
+                <w:szCs w:val="14"/>
+              </w:rPr>
+              <w:t>Clindamycin</w:t>
+            </w:r>
+            <w:proofErr w:type="spellEnd"/>
           </w:p>
         </w:tc>
         <w:tc>
@@ -3583,8 +4109,17 @@
                 <w:sz w:val="14"/>
                 <w:szCs w:val="14"/>
               </w:rPr>
-              <w:t>- Vancomycin</w:t>
-            </w:r>
+              <w:t xml:space="preserve">- </w:t>
+            </w:r>
+            <w:proofErr w:type="spellStart"/>
+            <w:r>
+              <w:rPr>
+                <w:sz w:val="14"/>
+                <w:szCs w:val="14"/>
+              </w:rPr>
+              <w:t>Vancomycin</w:t>
+            </w:r>
+            <w:proofErr w:type="spellEnd"/>
           </w:p>
         </w:tc>
         <w:tc>
@@ -3612,8 +4147,17 @@
                 <w:sz w:val="14"/>
                 <w:szCs w:val="14"/>
               </w:rPr>
-              <w:t>- Rifampicin</w:t>
-            </w:r>
+              <w:t xml:space="preserve">- </w:t>
+            </w:r>
+            <w:proofErr w:type="spellStart"/>
+            <w:r>
+              <w:rPr>
+                <w:sz w:val="14"/>
+                <w:szCs w:val="14"/>
+              </w:rPr>
+              <w:t>Rifampicin</w:t>
+            </w:r>
+            <w:proofErr w:type="spellEnd"/>
           </w:p>
         </w:tc>
         <w:tc>
@@ -3641,8 +4185,17 @@
                 <w:sz w:val="14"/>
                 <w:szCs w:val="14"/>
               </w:rPr>
-              <w:t>- Linezolid</w:t>
-            </w:r>
+              <w:t xml:space="preserve">- </w:t>
+            </w:r>
+            <w:proofErr w:type="spellStart"/>
+            <w:r>
+              <w:rPr>
+                <w:sz w:val="14"/>
+                <w:szCs w:val="14"/>
+              </w:rPr>
+              <w:t>Linezolid</w:t>
+            </w:r>
+            <w:proofErr w:type="spellEnd"/>
           </w:p>
         </w:tc>
         <w:tc>
@@ -3670,8 +4223,17 @@
                 <w:sz w:val="14"/>
                 <w:szCs w:val="14"/>
               </w:rPr>
-              <w:t>- Fosfomycin</w:t>
-            </w:r>
+              <w:t xml:space="preserve">- </w:t>
+            </w:r>
+            <w:proofErr w:type="spellStart"/>
+            <w:r>
+              <w:rPr>
+                <w:sz w:val="14"/>
+                <w:szCs w:val="14"/>
+              </w:rPr>
+              <w:t>Fosfomycin</w:t>
+            </w:r>
+            <w:proofErr w:type="spellEnd"/>
           </w:p>
         </w:tc>
         <w:tc>
@@ -3698,8 +4260,17 @@
                 <w:sz w:val="14"/>
                 <w:szCs w:val="14"/>
               </w:rPr>
-              <w:t>- Nitrofurantoin</w:t>
-            </w:r>
+              <w:t xml:space="preserve">- </w:t>
+            </w:r>
+            <w:proofErr w:type="spellStart"/>
+            <w:r>
+              <w:rPr>
+                <w:sz w:val="14"/>
+                <w:szCs w:val="14"/>
+              </w:rPr>
+              <w:t>Nitrofurantoin</w:t>
+            </w:r>
+            <w:proofErr w:type="spellEnd"/>
           </w:p>
         </w:tc>
         <w:tc>
@@ -3756,8 +4327,17 @@
                 <w:sz w:val="14"/>
                 <w:szCs w:val="14"/>
               </w:rPr>
-              <w:t>- Metronidazol</w:t>
-            </w:r>
+              <w:t xml:space="preserve">- </w:t>
+            </w:r>
+            <w:proofErr w:type="spellStart"/>
+            <w:r>
+              <w:rPr>
+                <w:sz w:val="14"/>
+                <w:szCs w:val="14"/>
+              </w:rPr>
+              <w:t>Metronidazol</w:t>
+            </w:r>
+            <w:proofErr w:type="spellEnd"/>
           </w:p>
         </w:tc>
       </w:tr>
@@ -3776,8 +4356,8 @@
                 <w:szCs w:val="16"/>
               </w:rPr>
             </w:pPr>
-            <w:bookmarkStart w:id="55" w:name="MibiErregerZelle1"/>
-            <w:bookmarkEnd w:id="55"/>
+            <w:bookmarkStart w:id="56" w:name="MibiErregerZelle1"/>
+            <w:bookmarkEnd w:id="56"/>
           </w:p>
         </w:tc>
         <w:tc>
@@ -4554,14 +5134,11 @@
       </w:tr>
     </w:tbl>
     <w:p>
-      <w:bookmarkStart w:id="56" w:name="MibiErreger"/>
-      <w:bookmarkEnd w:id="56"/>
+      <w:bookmarkStart w:id="57" w:name="MibiErreger"/>
+      <w:bookmarkEnd w:id="57"/>
     </w:p>
     <w:p/>
-    <w:p>
-      <w:bookmarkStart w:id="57" w:name="_GoBack"/>
-      <w:bookmarkEnd w:id="57"/>
-    </w:p>
+    <w:p/>
     <w:sectPr>
       <w:pgSz w:w="16838" w:h="11906" w:orient="landscape" w:code="9"/>
       <w:pgMar w:top="1125" w:right="567" w:bottom="1134" w:left="567" w:header="709" w:footer="709" w:gutter="0"/>
@@ -4572,6 +5149,31 @@
     </w:sectPr>
   </w:body>
 </w:document>
+</file>
+
+<file path=word/endnotes.xml><?xml version="1.0" encoding="utf-8"?>
+<w:endnotes xmlns:wpc="http://schemas.microsoft.com/office/word/2010/wordprocessingCanvas" xmlns:cx="http://schemas.microsoft.com/office/drawing/2014/chartex" xmlns:cx1="http://schemas.microsoft.com/office/drawing/2015/9/8/chartex" xmlns:mc="http://schemas.openxmlformats.org/markup-compatibility/2006" xmlns:o="urn:schemas-microsoft-com:office:office" xmlns:r="http://schemas.openxmlformats.org/officeDocument/2006/relationships" xmlns:m="http://schemas.openxmlformats.org/officeDocument/2006/math" xmlns:v="urn:schemas-microsoft-com:vml" xmlns:wp14="http://schemas.microsoft.com/office/word/2010/wordprocessingDrawing" xmlns:wp="http://schemas.openxmlformats.org/drawingml/2006/wordprocessingDrawing" xmlns:w10="urn:schemas-microsoft-com:office:word" xmlns:w="http://schemas.openxmlformats.org/wordprocessingml/2006/main" xmlns:w14="http://schemas.microsoft.com/office/word/2010/wordml" xmlns:w15="http://schemas.microsoft.com/office/word/2012/wordml" xmlns:w16se="http://schemas.microsoft.com/office/word/2015/wordml/symex" xmlns:wpg="http://schemas.microsoft.com/office/word/2010/wordprocessingGroup" xmlns:wpi="http://schemas.microsoft.com/office/word/2010/wordprocessingInk" xmlns:wne="http://schemas.microsoft.com/office/word/2006/wordml" xmlns:wps="http://schemas.microsoft.com/office/word/2010/wordprocessingShape" mc:Ignorable="w14 w15 w16se wp14">
+  <w:endnote w:type="separator" w:id="-1">
+    <w:p>
+      <w:pPr>
+        <w:spacing w:after="0" w:line="240" w:lineRule="auto"/>
+      </w:pPr>
+      <w:r>
+        <w:separator/>
+      </w:r>
+    </w:p>
+  </w:endnote>
+  <w:endnote w:type="continuationSeparator" w:id="0">
+    <w:p>
+      <w:pPr>
+        <w:spacing w:after="0" w:line="240" w:lineRule="auto"/>
+      </w:pPr>
+      <w:r>
+        <w:continuationSeparator/>
+      </w:r>
+    </w:p>
+  </w:endnote>
+</w:endnotes>
 </file>
 
 <file path=word/footer1.xml><?xml version="1.0" encoding="utf-8"?>
@@ -4646,11 +5248,12 @@
           </w:r>
           <w:r>
             <w:rPr>
+              <w:rFonts w:ascii="Times New Roman" w:eastAsia="Times New Roman" w:hAnsi="Times New Roman"/>
               <w:noProof/>
               <w:sz w:val="15"/>
               <w:szCs w:val="15"/>
             </w:rPr>
-            <w:t>17.07.2026</w:t>
+            <w:t>21.07.2026</w:t>
           </w:r>
           <w:r>
             <w:rPr>
@@ -4969,7 +5572,27 @@
               <w:sz w:val="16"/>
               <w:szCs w:val="16"/>
             </w:rPr>
-            <w:t>| Dickensweg 25 – 39 | 14055 Berlin</w:t>
+            <w:t xml:space="preserve">| </w:t>
+          </w:r>
+          <w:proofErr w:type="spellStart"/>
+          <w:r>
+            <w:rPr>
+              <w:bCs/>
+              <w:color w:val="5B9BD5" w:themeColor="accent1"/>
+              <w:sz w:val="16"/>
+              <w:szCs w:val="16"/>
+            </w:rPr>
+            <w:t>Dickensweg</w:t>
+          </w:r>
+          <w:proofErr w:type="spellEnd"/>
+          <w:r>
+            <w:rPr>
+              <w:bCs/>
+              <w:color w:val="5B9BD5" w:themeColor="accent1"/>
+              <w:sz w:val="16"/>
+              <w:szCs w:val="16"/>
+            </w:rPr>
+            <w:t xml:space="preserve"> 25 – 39 | 14055 Berlin</w:t>
           </w:r>
         </w:p>
         <w:p>
@@ -5056,6 +5679,7 @@
             </w:rPr>
             <w:t xml:space="preserve">Geschäftsführung: </w:t>
           </w:r>
+          <w:proofErr w:type="spellStart"/>
           <w:r>
             <w:rPr>
               <w:bCs/>
@@ -5063,7 +5687,17 @@
               <w:sz w:val="16"/>
               <w:szCs w:val="16"/>
             </w:rPr>
-            <w:t>Hamudi Mansour, Jean Franke</w:t>
+            <w:t>Hamudi</w:t>
+          </w:r>
+          <w:proofErr w:type="spellEnd"/>
+          <w:r>
+            <w:rPr>
+              <w:bCs/>
+              <w:color w:val="5B9BD5" w:themeColor="accent1"/>
+              <w:sz w:val="16"/>
+              <w:szCs w:val="16"/>
+            </w:rPr>
+            <w:t xml:space="preserve"> Mansour, Jean Franke</w:t>
           </w:r>
         </w:p>
         <w:p>
@@ -5114,6 +5748,7 @@
             </w:rPr>
             <w:t xml:space="preserve"> Berlin HRB 212848 B | </w:t>
           </w:r>
+          <w:proofErr w:type="spellStart"/>
           <w:r>
             <w:rPr>
               <w:b/>
@@ -5122,7 +5757,18 @@
               <w:sz w:val="16"/>
               <w:szCs w:val="16"/>
             </w:rPr>
-            <w:t>USt-IdNr.:</w:t>
+            <w:t>USt-IdNr</w:t>
+          </w:r>
+          <w:proofErr w:type="spellEnd"/>
+          <w:r>
+            <w:rPr>
+              <w:b/>
+              <w:bCs/>
+              <w:color w:val="5B9BD5" w:themeColor="accent1"/>
+              <w:sz w:val="16"/>
+              <w:szCs w:val="16"/>
+            </w:rPr>
+            <w:t>.:</w:t>
           </w:r>
           <w:r>
             <w:rPr>
@@ -5249,11 +5895,12 @@
           </w:r>
           <w:r>
             <w:rPr>
+              <w:rFonts w:ascii="Times New Roman" w:eastAsia="Times New Roman" w:hAnsi="Times New Roman"/>
               <w:noProof/>
               <w:sz w:val="15"/>
               <w:szCs w:val="15"/>
             </w:rPr>
-            <w:t>17.07.2026</w:t>
+            <w:t>21.07.2026</w:t>
           </w:r>
           <w:r>
             <w:rPr>
@@ -5399,6 +6046,31 @@
 </w:ftr>
 </file>
 
+<file path=word/footnotes.xml><?xml version="1.0" encoding="utf-8"?>
+<w:footnotes xmlns:wpc="http://schemas.microsoft.com/office/word/2010/wordprocessingCanvas" xmlns:cx="http://schemas.microsoft.com/office/drawing/2014/chartex" xmlns:cx1="http://schemas.microsoft.com/office/drawing/2015/9/8/chartex" xmlns:mc="http://schemas.openxmlformats.org/markup-compatibility/2006" xmlns:o="urn:schemas-microsoft-com:office:office" xmlns:r="http://schemas.openxmlformats.org/officeDocument/2006/relationships" xmlns:m="http://schemas.openxmlformats.org/officeDocument/2006/math" xmlns:v="urn:schemas-microsoft-com:vml" xmlns:wp14="http://schemas.microsoft.com/office/word/2010/wordprocessingDrawing" xmlns:wp="http://schemas.openxmlformats.org/drawingml/2006/wordprocessingDrawing" xmlns:w10="urn:schemas-microsoft-com:office:word" xmlns:w="http://schemas.openxmlformats.org/wordprocessingml/2006/main" xmlns:w14="http://schemas.microsoft.com/office/word/2010/wordml" xmlns:w15="http://schemas.microsoft.com/office/word/2012/wordml" xmlns:w16se="http://schemas.microsoft.com/office/word/2015/wordml/symex" xmlns:wpg="http://schemas.microsoft.com/office/word/2010/wordprocessingGroup" xmlns:wpi="http://schemas.microsoft.com/office/word/2010/wordprocessingInk" xmlns:wne="http://schemas.microsoft.com/office/word/2006/wordml" xmlns:wps="http://schemas.microsoft.com/office/word/2010/wordprocessingShape" mc:Ignorable="w14 w15 w16se wp14">
+  <w:footnote w:type="separator" w:id="-1">
+    <w:p>
+      <w:pPr>
+        <w:spacing w:after="0" w:line="240" w:lineRule="auto"/>
+      </w:pPr>
+      <w:r>
+        <w:separator/>
+      </w:r>
+    </w:p>
+  </w:footnote>
+  <w:footnote w:type="continuationSeparator" w:id="0">
+    <w:p>
+      <w:pPr>
+        <w:spacing w:after="0" w:line="240" w:lineRule="auto"/>
+      </w:pPr>
+      <w:r>
+        <w:continuationSeparator/>
+      </w:r>
+    </w:p>
+  </w:footnote>
+</w:footnotes>
+</file>
+
 <file path=word/header1.xml><?xml version="1.0" encoding="utf-8"?>
 <w:hdr xmlns:wpc="http://schemas.microsoft.com/office/word/2010/wordprocessingCanvas" xmlns:cx="http://schemas.microsoft.com/office/drawing/2014/chartex" xmlns:cx1="http://schemas.microsoft.com/office/drawing/2015/9/8/chartex" xmlns:mc="http://schemas.openxmlformats.org/markup-compatibility/2006" xmlns:o="urn:schemas-microsoft-com:office:office" xmlns:r="http://schemas.openxmlformats.org/officeDocument/2006/relationships" xmlns:m="http://schemas.openxmlformats.org/officeDocument/2006/math" xmlns:v="urn:schemas-microsoft-com:vml" xmlns:wp14="http://schemas.microsoft.com/office/word/2010/wordprocessingDrawing" xmlns:wp="http://schemas.openxmlformats.org/drawingml/2006/wordprocessingDrawing" xmlns:w10="urn:schemas-microsoft-com:office:word" xmlns:w="http://schemas.openxmlformats.org/wordprocessingml/2006/main" xmlns:w14="http://schemas.microsoft.com/office/word/2010/wordml" xmlns:w15="http://schemas.microsoft.com/office/word/2012/wordml" xmlns:w16se="http://schemas.microsoft.com/office/word/2015/wordml/symex" xmlns:wpg="http://schemas.microsoft.com/office/word/2010/wordprocessingGroup" xmlns:wpi="http://schemas.microsoft.com/office/word/2010/wordprocessingInk" xmlns:wne="http://schemas.microsoft.com/office/word/2006/wordml" xmlns:wps="http://schemas.microsoft.com/office/word/2010/wordprocessingShape" mc:Ignorable="w14 w15 w16se wp14">
   <w:p>
@@ -5415,8 +6087,13 @@
     <w:pPr>
       <w:pStyle w:val="Kopfzeile"/>
     </w:pPr>
+    <w:proofErr w:type="gramStart"/>
     <w:r>
-      <w:t>Patient : [NPAT-VNAME] [NPAT-NAMZU] [NPAT-NNAME] geb. [NPAT-GBDAT]</w:t>
+      <w:t>Patient :</w:t>
+    </w:r>
+    <w:proofErr w:type="gramEnd"/>
+    <w:r>
+      <w:t xml:space="preserve"> [NPAT-VNAME] [NPAT-NAMZU] [NPAT-NNAME] geb. [NPAT-GBDAT]</w:t>
     </w:r>
     <w:r>
       <w:tab/>
@@ -5437,7 +6114,7 @@
       <w:pStyle w:val="SanaKliniken"/>
       <w:framePr w:w="3549" w:wrap="around" w:hAnchor="page" w:x="1436"/>
     </w:pPr>
-    <w:bookmarkStart w:id="4" w:name="_Hlk108784881"/>
+    <w:bookmarkStart w:id="5" w:name="_Hlk108784881"/>
     <w:r>
       <w:rPr>
         <w:noProof/>
@@ -5656,7 +6333,7 @@
         </wp:anchor>
       </w:drawing>
     </w:r>
-    <w:bookmarkEnd w:id="4"/>
+    <w:bookmarkEnd w:id="5"/>
   </w:p>
 </w:hdr>
 </file>
@@ -5670,11 +6347,13 @@
         <w:bottom w:val="single" w:sz="4" w:space="1" w:color="auto"/>
       </w:pBdr>
     </w:pPr>
+    <w:proofErr w:type="gramStart"/>
     <w:r>
-      <w:t xml:space="preserve">Patient : [NPAT-VNAME] </w:t>
+      <w:t>Patient :</w:t>
     </w:r>
+    <w:proofErr w:type="gramEnd"/>
     <w:r>
-      <w:t>[NPAT-NAMZU] [NPAT-NNAME] geb. [NPAT-GBDAT]</w:t>
+      <w:t xml:space="preserve"> [NPAT-VNAME] [NPAT-NAMZU] [NPAT-NNAME] geb. [NPAT-GBDAT]</w:t>
     </w:r>
     <w:r>
       <w:tab/>
@@ -6076,6 +6755,10 @@
   <w:style w:type="paragraph" w:default="1" w:styleId="Standard">
     <w:name w:val="Normal"/>
     <w:qFormat/>
+    <w:rsid w:val="00563D94"/>
+    <w:rPr>
+      <w:rFonts w:ascii="Calibri" w:eastAsia="Calibri" w:hAnsi="Calibri" w:cs="Times New Roman"/>
+    </w:rPr>
   </w:style>
   <w:style w:type="paragraph" w:styleId="berschrift1">
     <w:name w:val="heading 1"/>
@@ -6108,6 +6791,7 @@
     <w:uiPriority w:val="1"/>
     <w:semiHidden/>
     <w:unhideWhenUsed/>
+    <w:rsid w:val="00563D94"/>
   </w:style>
   <w:style w:type="table" w:default="1" w:styleId="NormaleTabelle">
     <w:name w:val="Normal Table"/>
@@ -6129,6 +6813,7 @@
     <w:uiPriority w:val="99"/>
     <w:semiHidden/>
     <w:unhideWhenUsed/>
+    <w:rsid w:val="00563D94"/>
   </w:style>
   <w:style w:type="character" w:customStyle="1" w:styleId="berschrift1Zchn">
     <w:name w:val="Überschrift 1 Zchn"/>
@@ -6156,7 +6841,7 @@
       <w:jc w:val="both"/>
     </w:pPr>
     <w:rPr>
-      <w:rFonts w:ascii="Arial" w:eastAsia="Times New Roman" w:hAnsi="Arial" w:cs="Times New Roman"/>
+      <w:rFonts w:ascii="Arial" w:eastAsia="Times New Roman" w:hAnsi="Arial"/>
       <w:sz w:val="20"/>
       <w:szCs w:val="24"/>
       <w:lang w:eastAsia="de-DE"/>
@@ -6177,7 +6862,7 @@
       <w:jc w:val="both"/>
     </w:pPr>
     <w:rPr>
-      <w:rFonts w:ascii="Arial" w:eastAsia="Times New Roman" w:hAnsi="Arial" w:cs="Times New Roman"/>
+      <w:rFonts w:ascii="Arial" w:eastAsia="Times New Roman" w:hAnsi="Arial"/>
       <w:sz w:val="20"/>
       <w:szCs w:val="24"/>
       <w:lang w:eastAsia="de-DE"/>
@@ -6211,7 +6896,7 @@
       <w:jc w:val="both"/>
     </w:pPr>
     <w:rPr>
-      <w:rFonts w:ascii="Arial" w:eastAsia="Times New Roman" w:hAnsi="Arial" w:cs="Times New Roman"/>
+      <w:rFonts w:ascii="Arial" w:eastAsia="Times New Roman" w:hAnsi="Arial"/>
       <w:sz w:val="20"/>
       <w:szCs w:val="24"/>
       <w:lang w:eastAsia="de-DE"/>
@@ -6283,7 +6968,7 @@
       <w:jc w:val="both"/>
     </w:pPr>
     <w:rPr>
-      <w:rFonts w:ascii="Arial" w:eastAsia="Times New Roman" w:hAnsi="Arial" w:cs="Times New Roman"/>
+      <w:rFonts w:ascii="Arial" w:eastAsia="Times New Roman" w:hAnsi="Arial"/>
       <w:sz w:val="20"/>
       <w:szCs w:val="24"/>
       <w:lang w:eastAsia="de-DE"/>
@@ -6304,7 +6989,7 @@
       <w:spacing w:after="0" w:line="240" w:lineRule="auto"/>
     </w:pPr>
     <w:rPr>
-      <w:rFonts w:ascii="Arial" w:eastAsia="Times New Roman" w:hAnsi="Arial" w:cs="Times New Roman"/>
+      <w:rFonts w:ascii="Arial" w:eastAsia="Times New Roman" w:hAnsi="Arial"/>
       <w:sz w:val="20"/>
       <w:szCs w:val="24"/>
       <w:lang w:eastAsia="de-DE"/>
@@ -6326,7 +7011,7 @@
       <w:spacing w:after="0" w:line="320" w:lineRule="exact"/>
     </w:pPr>
     <w:rPr>
-      <w:rFonts w:ascii="Arial" w:eastAsia="Times New Roman" w:hAnsi="Arial" w:cs="Times New Roman"/>
+      <w:rFonts w:ascii="Arial" w:eastAsia="Times New Roman" w:hAnsi="Arial"/>
       <w:b/>
       <w:color w:val="0069B4"/>
       <w:kern w:val="12"/>
@@ -6430,6 +7115,7 @@
   <w:rsids>
     <w:rsidRoot w:val="005F1902"/>
     <w:rsid w:val="005F1902"/>
+    <w:rsid w:val="00626B68"/>
   </w:rsids>
   <m:mathPr>
     <m:mathFont m:val="Cambria Math"/>

</xml_diff>

<commit_message>
Vor neuen Änderung f. Transfusionstabelle
</commit_message>
<xml_diff>
--- a/XTTEMP_PaArztBrief_Version71.docx
+++ b/XTTEMP_PaArztBrief_Version71.docx
@@ -423,7 +423,6 @@
                                         </w:rPr>
                                         <w:t>03.06.2026</w:t>
                                       </w:r>
-                                      <w:bookmarkStart w:id="2" w:name="HIDDEN_CREATE_STATUS"/>
                                       <w:bookmarkEnd w:id="1"/>
                                       <w:r>
                                         <w:rPr>
@@ -433,18 +432,7 @@
                                           <w:szCs w:val="15"/>
                                           <w:lang w:eastAsia="en-US"/>
                                         </w:rPr>
-                                        <w:t>[X]</w:t>
-                                      </w:r>
-                                      <w:bookmarkEnd w:id="2"/>
-                                      <w:r>
-                                        <w:rPr>
-                                          <w:rFonts w:cs="Arial"/>
-                                          <w:color w:val="FFFFFF" w:themeColor="background1"/>
-                                          <w:sz w:val="15"/>
-                                          <w:szCs w:val="15"/>
-                                          <w:lang w:eastAsia="en-US"/>
-                                        </w:rPr>
-                                        <w:t>]]</w:t>
+                                        <w:t>[X]]]</w:t>
                                       </w:r>
                                       <w:r>
                                         <w:rPr>
@@ -907,7 +895,7 @@
                                   </w:rPr>
                                   <w:t xml:space="preserve">Berlin, </w:t>
                                 </w:r>
-                                <w:bookmarkStart w:id="3" w:name="AUTODATE"/>
+                                <w:bookmarkStart w:id="2" w:name="AUTODATE"/>
                                 <w:r>
                                   <w:rPr>
                                     <w:rFonts w:cs="Arial"/>
@@ -917,8 +905,7 @@
                                   </w:rPr>
                                   <w:t>03.06.2026</w:t>
                                 </w:r>
-                                <w:bookmarkStart w:id="4" w:name="HIDDEN_CREATE_STATUS"/>
-                                <w:bookmarkEnd w:id="3"/>
+                                <w:bookmarkEnd w:id="2"/>
                                 <w:r>
                                   <w:rPr>
                                     <w:rFonts w:cs="Arial"/>
@@ -927,18 +914,7 @@
                                     <w:szCs w:val="15"/>
                                     <w:lang w:eastAsia="en-US"/>
                                   </w:rPr>
-                                  <w:t>[X]</w:t>
-                                </w:r>
-                                <w:bookmarkEnd w:id="4"/>
-                                <w:r>
-                                  <w:rPr>
-                                    <w:rFonts w:cs="Arial"/>
-                                    <w:color w:val="FFFFFF" w:themeColor="background1"/>
-                                    <w:sz w:val="15"/>
-                                    <w:szCs w:val="15"/>
-                                    <w:lang w:eastAsia="en-US"/>
-                                  </w:rPr>
-                                  <w:t>]]</w:t>
+                                  <w:t>[X]]]</w:t>
                                 </w:r>
                                 <w:r>
                                   <w:rPr>
@@ -1198,7 +1174,7 @@
           </w:ffData>
         </w:fldChar>
       </w:r>
-      <w:bookmarkStart w:id="6" w:name="STRASSERST"/>
+      <w:bookmarkStart w:id="4" w:name="STRASSERST"/>
       <w:r>
         <w:instrText xml:space="preserve"> FORMTEXT </w:instrText>
       </w:r>
@@ -1238,7 +1214,7 @@
       <w:r>
         <w:fldChar w:fldCharType="end"/>
       </w:r>
-      <w:bookmarkEnd w:id="6"/>
+      <w:bookmarkEnd w:id="4"/>
       <w:r>
         <w:tab/>
       </w:r>
@@ -1315,7 +1291,7 @@
           </w:ffData>
         </w:fldChar>
       </w:r>
-      <w:bookmarkStart w:id="7" w:name="ORTERST"/>
+      <w:bookmarkStart w:id="5" w:name="ORTERST"/>
       <w:r>
         <w:instrText xml:space="preserve"> FORMTEXT </w:instrText>
       </w:r>
@@ -1355,7 +1331,7 @@
       <w:r>
         <w:fldChar w:fldCharType="end"/>
       </w:r>
-      <w:bookmarkEnd w:id="7"/>
+      <w:bookmarkEnd w:id="5"/>
     </w:p>
     <w:p/>
     <w:p/>
@@ -1481,7 +1457,7 @@
           </w:ffData>
         </w:fldChar>
       </w:r>
-      <w:bookmarkStart w:id="8" w:name="NAMEINFO3"/>
+      <w:bookmarkStart w:id="6" w:name="NAMEINFO3"/>
       <w:r>
         <w:instrText xml:space="preserve"> FORMTEXT </w:instrText>
       </w:r>
@@ -1521,7 +1497,7 @@
       <w:r>
         <w:fldChar w:fldCharType="end"/>
       </w:r>
-      <w:bookmarkEnd w:id="8"/>
+      <w:bookmarkEnd w:id="6"/>
     </w:p>
     <w:p>
       <w:r>
@@ -1534,7 +1510,7 @@
           </w:ffData>
         </w:fldChar>
       </w:r>
-      <w:bookmarkStart w:id="9" w:name="NAMEINFO4"/>
+      <w:bookmarkStart w:id="7" w:name="NAMEINFO4"/>
       <w:r>
         <w:instrText xml:space="preserve"> FORMTEXT </w:instrText>
       </w:r>
@@ -1574,7 +1550,7 @@
       <w:r>
         <w:fldChar w:fldCharType="end"/>
       </w:r>
-      <w:bookmarkEnd w:id="9"/>
+      <w:bookmarkEnd w:id="7"/>
     </w:p>
     <w:p>
       <w:r>
@@ -1587,7 +1563,7 @@
           </w:ffData>
         </w:fldChar>
       </w:r>
-      <w:bookmarkStart w:id="10" w:name="NAMEINFO5"/>
+      <w:bookmarkStart w:id="8" w:name="NAMEINFO5"/>
       <w:r>
         <w:instrText xml:space="preserve"> FORMTEXT </w:instrText>
       </w:r>
@@ -1627,7 +1603,7 @@
       <w:r>
         <w:fldChar w:fldCharType="end"/>
       </w:r>
-      <w:bookmarkEnd w:id="10"/>
+      <w:bookmarkEnd w:id="8"/>
     </w:p>
     <w:p/>
     <w:p/>
@@ -1643,7 +1619,7 @@
           </w:ffData>
         </w:fldChar>
       </w:r>
-      <w:bookmarkStart w:id="11" w:name="ANSPRACHE"/>
+      <w:bookmarkStart w:id="9" w:name="ANSPRACHE"/>
       <w:r>
         <w:instrText xml:space="preserve"> FORMTEXT </w:instrText>
       </w:r>
@@ -1683,7 +1659,7 @@
       <w:r>
         <w:fldChar w:fldCharType="end"/>
       </w:r>
-      <w:bookmarkEnd w:id="11"/>
+      <w:bookmarkEnd w:id="9"/>
       <w:r>
         <w:t>,</w:t>
       </w:r>
@@ -1760,21 +1736,7 @@
         <w:rPr>
           <w:bCs/>
         </w:rPr>
-        <w:t>[</w:t>
-      </w:r>
-      <w:proofErr w:type="gramStart"/>
-      <w:r>
-        <w:rPr>
-          <w:bCs/>
-        </w:rPr>
-        <w:t>U:ARTIKEL</w:t>
-      </w:r>
-      <w:proofErr w:type="gramEnd"/>
-      <w:r>
-        <w:rPr>
-          <w:bCs/>
-        </w:rPr>
-        <w:t xml:space="preserve">] sich vom </w:t>
+        <w:t xml:space="preserve">[U:ARTIKEL] sich vom </w:t>
       </w:r>
       <w:r>
         <w:t>[NBEW-BWIDT] bis [U:ENTL-BWIDT]</w:t>
@@ -1811,15 +1773,7 @@
         <w:pStyle w:val="Diagnose"/>
       </w:pPr>
       <w:r>
-        <w:t>[</w:t>
-      </w:r>
-      <w:proofErr w:type="gramStart"/>
-      <w:r>
-        <w:t>USER:DIATAB</w:t>
-      </w:r>
-      <w:proofErr w:type="gramEnd"/>
-      <w:r>
-        <w:t>-DIA_DKEY]</w:t>
+        <w:t>[USER:DIATAB-DIA_DKEY]</w:t>
       </w:r>
       <w:r>
         <w:tab/>
@@ -1869,15 +1823,7 @@
         <w:pStyle w:val="Diagnose"/>
       </w:pPr>
       <w:r>
-        <w:t>[</w:t>
-      </w:r>
-      <w:proofErr w:type="gramStart"/>
-      <w:r>
-        <w:t>USER:PROCTAB</w:t>
-      </w:r>
-      <w:proofErr w:type="gramEnd"/>
-      <w:r>
-        <w:t>-</w:t>
+        <w:t>[USER:PROCTAB-</w:t>
       </w:r>
       <w:r>
         <w:t>PROC_</w:t>
@@ -1910,133 +1856,133 @@
       <w:r>
         <w:t xml:space="preserve"> </w:t>
       </w:r>
-      <w:bookmarkStart w:id="12" w:name="Anamnese"/>
+      <w:bookmarkStart w:id="10" w:name="Anamnese"/>
+      <w:bookmarkEnd w:id="10"/>
+      <w:r>
+        <w:t xml:space="preserve"> </w:t>
+      </w:r>
+      <w:bookmarkStart w:id="11" w:name="Opbericht"/>
+      <w:bookmarkEnd w:id="11"/>
+      <w:r>
+        <w:t xml:space="preserve"> </w:t>
+      </w:r>
+      <w:bookmarkStart w:id="12" w:name="koerper"/>
       <w:bookmarkEnd w:id="12"/>
       <w:r>
         <w:t xml:space="preserve"> </w:t>
       </w:r>
-      <w:bookmarkStart w:id="13" w:name="Opbericht"/>
+      <w:bookmarkStart w:id="13" w:name="ROE"/>
       <w:bookmarkEnd w:id="13"/>
       <w:r>
         <w:t xml:space="preserve"> </w:t>
       </w:r>
-      <w:bookmarkStart w:id="14" w:name="koerper"/>
+      <w:bookmarkStart w:id="14" w:name="EKG"/>
       <w:bookmarkEnd w:id="14"/>
       <w:r>
         <w:t xml:space="preserve"> </w:t>
       </w:r>
-      <w:bookmarkStart w:id="15" w:name="ROE"/>
+      <w:bookmarkStart w:id="15" w:name="Ekgbelast"/>
+      <w:bookmarkStart w:id="16" w:name="LangzRR"/>
       <w:bookmarkEnd w:id="15"/>
+      <w:bookmarkEnd w:id="16"/>
       <w:r>
         <w:t xml:space="preserve"> </w:t>
       </w:r>
-      <w:bookmarkStart w:id="16" w:name="EKG"/>
-      <w:bookmarkEnd w:id="16"/>
+      <w:bookmarkStart w:id="17" w:name="Ekglangzeit"/>
+      <w:bookmarkEnd w:id="17"/>
       <w:r>
         <w:t xml:space="preserve"> </w:t>
       </w:r>
-      <w:bookmarkStart w:id="17" w:name="Ekgbelast"/>
-      <w:bookmarkStart w:id="18" w:name="LangzRR"/>
-      <w:bookmarkEnd w:id="17"/>
+      <w:bookmarkStart w:id="18" w:name="Echokard"/>
       <w:bookmarkEnd w:id="18"/>
       <w:r>
         <w:t xml:space="preserve"> </w:t>
       </w:r>
-      <w:bookmarkStart w:id="19" w:name="Ekglangzeit"/>
+      <w:bookmarkStart w:id="19" w:name="Sonobauch"/>
       <w:bookmarkEnd w:id="19"/>
       <w:r>
         <w:t xml:space="preserve"> </w:t>
       </w:r>
-      <w:bookmarkStart w:id="20" w:name="Echokard"/>
+      <w:bookmarkStart w:id="20" w:name="Sonosd"/>
       <w:bookmarkEnd w:id="20"/>
       <w:r>
         <w:t xml:space="preserve"> </w:t>
       </w:r>
-      <w:bookmarkStart w:id="21" w:name="Sonobauch"/>
+      <w:bookmarkStart w:id="21" w:name="Sonogef"/>
       <w:bookmarkEnd w:id="21"/>
       <w:r>
         <w:t xml:space="preserve"> </w:t>
       </w:r>
-      <w:bookmarkStart w:id="22" w:name="Sonosd"/>
+      <w:bookmarkStart w:id="22" w:name="Sonograf"/>
       <w:bookmarkEnd w:id="22"/>
       <w:r>
         <w:t xml:space="preserve"> </w:t>
       </w:r>
-      <w:bookmarkStart w:id="23" w:name="Sonogef"/>
+      <w:bookmarkStart w:id="23" w:name="Gynkonsil"/>
+      <w:bookmarkStart w:id="24" w:name="Schrittmacher"/>
       <w:bookmarkEnd w:id="23"/>
+      <w:bookmarkEnd w:id="24"/>
       <w:r>
         <w:t xml:space="preserve"> </w:t>
       </w:r>
-      <w:bookmarkStart w:id="24" w:name="Sonograf"/>
-      <w:bookmarkEnd w:id="24"/>
+      <w:bookmarkStart w:id="25" w:name="Chikonsil"/>
+      <w:bookmarkEnd w:id="25"/>
       <w:r>
         <w:t xml:space="preserve"> </w:t>
       </w:r>
-      <w:bookmarkStart w:id="25" w:name="Gynkonsil"/>
-      <w:bookmarkStart w:id="26" w:name="Schrittmacher"/>
-      <w:bookmarkEnd w:id="25"/>
+      <w:bookmarkStart w:id="26" w:name="Sonstkonsil"/>
       <w:bookmarkEnd w:id="26"/>
       <w:r>
         <w:t xml:space="preserve"> </w:t>
       </w:r>
-      <w:bookmarkStart w:id="27" w:name="Chikonsil"/>
+      <w:bookmarkStart w:id="27" w:name="Hnokonsil"/>
       <w:bookmarkEnd w:id="27"/>
       <w:r>
         <w:t xml:space="preserve"> </w:t>
       </w:r>
-      <w:bookmarkStart w:id="28" w:name="Sonstkonsil"/>
+      <w:bookmarkStart w:id="28" w:name="Neukonsil"/>
       <w:bookmarkEnd w:id="28"/>
       <w:r>
         <w:t xml:space="preserve"> </w:t>
       </w:r>
-      <w:bookmarkStart w:id="29" w:name="Hnokonsil"/>
+      <w:bookmarkStart w:id="29" w:name="Urokonsil"/>
       <w:bookmarkEnd w:id="29"/>
       <w:r>
         <w:t xml:space="preserve"> </w:t>
       </w:r>
-      <w:bookmarkStart w:id="30" w:name="Neukonsil"/>
+      <w:bookmarkStart w:id="30" w:name="Derkonsil"/>
       <w:bookmarkEnd w:id="30"/>
       <w:r>
         <w:t xml:space="preserve"> </w:t>
       </w:r>
-      <w:bookmarkStart w:id="31" w:name="Urokonsil"/>
+      <w:bookmarkStart w:id="31" w:name="Augkonsil"/>
       <w:bookmarkEnd w:id="31"/>
       <w:r>
         <w:t xml:space="preserve"> </w:t>
       </w:r>
-      <w:bookmarkStart w:id="32" w:name="Derkonsil"/>
+      <w:bookmarkStart w:id="32" w:name="Zahkonsil"/>
+      <w:bookmarkStart w:id="33" w:name="Endo"/>
+      <w:bookmarkStart w:id="34" w:name="Diaet"/>
       <w:bookmarkEnd w:id="32"/>
+      <w:bookmarkEnd w:id="33"/>
+      <w:bookmarkEnd w:id="34"/>
       <w:r>
         <w:t xml:space="preserve"> </w:t>
       </w:r>
-      <w:bookmarkStart w:id="33" w:name="Augkonsil"/>
-      <w:bookmarkEnd w:id="33"/>
-      <w:r>
-        <w:t xml:space="preserve"> </w:t>
-      </w:r>
-      <w:bookmarkStart w:id="34" w:name="Zahkonsil"/>
-      <w:bookmarkStart w:id="35" w:name="Endo"/>
-      <w:bookmarkStart w:id="36" w:name="Diaet"/>
-      <w:bookmarkEnd w:id="34"/>
+      <w:bookmarkStart w:id="35" w:name="Lufu"/>
+      <w:bookmarkStart w:id="36" w:name="Dialyse"/>
+      <w:bookmarkStart w:id="37" w:name="Rechtsherz"/>
+      <w:bookmarkStart w:id="38" w:name="Gehtest"/>
+      <w:bookmarkStart w:id="39" w:name="MibiErregerHinweis"/>
+      <w:bookmarkStart w:id="40" w:name="Karotidendoppler"/>
+      <w:bookmarkStart w:id="41" w:name="Knochenmarkbiopsie"/>
       <w:bookmarkEnd w:id="35"/>
       <w:bookmarkEnd w:id="36"/>
-      <w:r>
-        <w:t xml:space="preserve"> </w:t>
-      </w:r>
-      <w:bookmarkStart w:id="37" w:name="Lufu"/>
-      <w:bookmarkStart w:id="38" w:name="Dialyse"/>
-      <w:bookmarkStart w:id="39" w:name="Rechtsherz"/>
-      <w:bookmarkStart w:id="40" w:name="Gehtest"/>
-      <w:bookmarkStart w:id="41" w:name="MibiErregerHinweis"/>
-      <w:bookmarkStart w:id="42" w:name="Karotidendoppler"/>
-      <w:bookmarkStart w:id="43" w:name="Knochenmarkbiopsie"/>
       <w:bookmarkEnd w:id="37"/>
       <w:bookmarkEnd w:id="38"/>
       <w:bookmarkEnd w:id="39"/>
       <w:bookmarkEnd w:id="40"/>
       <w:bookmarkEnd w:id="41"/>
-      <w:bookmarkEnd w:id="42"/>
-      <w:bookmarkEnd w:id="43"/>
     </w:p>
     <w:p/>
     <w:p>
@@ -2047,8 +1993,8 @@
       <w:r>
         <w:t>Labor</w:t>
       </w:r>
-      <w:bookmarkStart w:id="44" w:name="LaborStart"/>
-      <w:bookmarkEnd w:id="44"/>
+      <w:bookmarkStart w:id="42" w:name="LaborStart"/>
+      <w:bookmarkEnd w:id="42"/>
       <w:r>
         <w:t>parameter</w:t>
       </w:r>
@@ -2058,8 +2004,8 @@
       </w:r>
     </w:p>
     <w:p>
-      <w:bookmarkStart w:id="45" w:name="Labor"/>
-      <w:bookmarkEnd w:id="45"/>
+      <w:bookmarkStart w:id="43" w:name="Labor"/>
+      <w:bookmarkEnd w:id="43"/>
     </w:p>
     <w:p/>
     <w:p>
@@ -2088,8 +2034,8 @@
       </w:r>
     </w:p>
     <w:p>
-      <w:bookmarkStart w:id="46" w:name="OPBerichtPMD"/>
-      <w:bookmarkEnd w:id="46"/>
+      <w:bookmarkStart w:id="44" w:name="OPBerichtPMD"/>
+      <w:bookmarkEnd w:id="44"/>
     </w:p>
     <w:p>
       <w:pPr>
@@ -2113,18 +2059,18 @@
       </w:r>
     </w:p>
     <w:p>
-      <w:bookmarkStart w:id="47" w:name="Blutprodukte"/>
-      <w:bookmarkEnd w:id="47"/>
+      <w:bookmarkStart w:id="45" w:name="Blutprodukte"/>
+      <w:bookmarkEnd w:id="45"/>
     </w:p>
     <w:p/>
     <w:p>
       <w:pPr>
         <w:pStyle w:val="berschrift1"/>
       </w:pPr>
-      <w:bookmarkStart w:id="48" w:name="Antibiotika"/>
-      <w:bookmarkStart w:id="49" w:name="Blutkomp"/>
-      <w:bookmarkEnd w:id="48"/>
-      <w:bookmarkEnd w:id="49"/>
+      <w:bookmarkStart w:id="46" w:name="Antibiotika"/>
+      <w:bookmarkStart w:id="47" w:name="Blutkomp"/>
+      <w:bookmarkEnd w:id="46"/>
+      <w:bookmarkEnd w:id="47"/>
       <w:proofErr w:type="spellStart"/>
       <w:r>
         <w:t>Medikation</w:t>
@@ -2135,8 +2081,8 @@
       </w:r>
     </w:p>
     <w:p>
-      <w:bookmarkStart w:id="50" w:name="StandMedikation"/>
-      <w:bookmarkEnd w:id="50"/>
+      <w:bookmarkStart w:id="48" w:name="StandMedikation"/>
+      <w:bookmarkEnd w:id="48"/>
     </w:p>
     <w:tbl>
       <w:tblPr>
@@ -2423,8 +2369,8 @@
             <w:shd w:val="clear" w:color="auto" w:fill="auto"/>
           </w:tcPr>
           <w:p>
-            <w:bookmarkStart w:id="51" w:name="MEDIKAMENT"/>
-            <w:bookmarkEnd w:id="51"/>
+            <w:bookmarkStart w:id="49" w:name="MEDIKAMENT"/>
+            <w:bookmarkEnd w:id="49"/>
           </w:p>
         </w:tc>
         <w:tc>
@@ -2514,12 +2460,12 @@
       </w:tr>
     </w:tbl>
     <w:p>
-      <w:bookmarkStart w:id="52" w:name="MEDIKA_TEXT"/>
-      <w:bookmarkEnd w:id="52"/>
+      <w:bookmarkStart w:id="50" w:name="MEDIKA_TEXT"/>
+      <w:bookmarkEnd w:id="50"/>
     </w:p>
     <w:p>
-      <w:bookmarkStart w:id="53" w:name="Epikrise"/>
-      <w:bookmarkEnd w:id="53"/>
+      <w:bookmarkStart w:id="51" w:name="Epikrise"/>
+      <w:bookmarkEnd w:id="51"/>
       <w:r>
         <w:t>Wir danken Ihnen für die Überweisung des Patienten und verbleiben</w:t>
       </w:r>
@@ -2584,15 +2530,15 @@
         <w:tab/>
         <w:t>Stationsarzt</w:t>
       </w:r>
-      <w:bookmarkStart w:id="54" w:name="Unterschrift"/>
-      <w:bookmarkEnd w:id="54"/>
+      <w:bookmarkStart w:id="52" w:name="Unterschrift"/>
+      <w:bookmarkEnd w:id="52"/>
     </w:p>
     <w:p>
       <w:pPr>
         <w:pStyle w:val="berschrift1"/>
       </w:pPr>
-      <w:bookmarkStart w:id="55" w:name="MibiErregerTabelle1"/>
-      <w:bookmarkEnd w:id="55"/>
+      <w:bookmarkStart w:id="53" w:name="MibiErregerTabelle1"/>
+      <w:bookmarkEnd w:id="53"/>
     </w:p>
     <w:tbl>
       <w:tblPr>
@@ -4356,8 +4302,8 @@
                 <w:szCs w:val="16"/>
               </w:rPr>
             </w:pPr>
-            <w:bookmarkStart w:id="56" w:name="MibiErregerZelle1"/>
-            <w:bookmarkEnd w:id="56"/>
+            <w:bookmarkStart w:id="54" w:name="MibiErregerZelle1"/>
+            <w:bookmarkEnd w:id="54"/>
           </w:p>
         </w:tc>
         <w:tc>
@@ -5134,8 +5080,8 @@
       </w:tr>
     </w:tbl>
     <w:p>
-      <w:bookmarkStart w:id="57" w:name="MibiErreger"/>
-      <w:bookmarkEnd w:id="57"/>
+      <w:bookmarkStart w:id="55" w:name="MibiErreger"/>
+      <w:bookmarkEnd w:id="55"/>
     </w:p>
     <w:p/>
     <w:p/>
@@ -5248,12 +5194,11 @@
           </w:r>
           <w:r>
             <w:rPr>
-              <w:rFonts w:ascii="Times New Roman" w:eastAsia="Times New Roman" w:hAnsi="Times New Roman"/>
               <w:noProof/>
               <w:sz w:val="15"/>
               <w:szCs w:val="15"/>
             </w:rPr>
-            <w:t>21.07.2026</w:t>
+            <w:t>24.07.2026</w:t>
           </w:r>
           <w:r>
             <w:rPr>
@@ -5895,12 +5840,11 @@
           </w:r>
           <w:r>
             <w:rPr>
-              <w:rFonts w:ascii="Times New Roman" w:eastAsia="Times New Roman" w:hAnsi="Times New Roman"/>
               <w:noProof/>
               <w:sz w:val="15"/>
               <w:szCs w:val="15"/>
             </w:rPr>
-            <w:t>21.07.2026</w:t>
+            <w:t>24.07.2026</w:t>
           </w:r>
           <w:r>
             <w:rPr>
@@ -6087,13 +6031,8 @@
     <w:pPr>
       <w:pStyle w:val="Kopfzeile"/>
     </w:pPr>
-    <w:proofErr w:type="gramStart"/>
     <w:r>
-      <w:t>Patient :</w:t>
-    </w:r>
-    <w:proofErr w:type="gramEnd"/>
-    <w:r>
-      <w:t xml:space="preserve"> [NPAT-VNAME] [NPAT-NAMZU] [NPAT-NNAME] geb. [NPAT-GBDAT]</w:t>
+      <w:t>Patient : [NPAT-VNAME] [NPAT-NAMZU] [NPAT-NNAME] geb. [NPAT-GBDAT]</w:t>
     </w:r>
     <w:r>
       <w:tab/>
@@ -6114,7 +6053,7 @@
       <w:pStyle w:val="SanaKliniken"/>
       <w:framePr w:w="3549" w:wrap="around" w:hAnchor="page" w:x="1436"/>
     </w:pPr>
-    <w:bookmarkStart w:id="5" w:name="_Hlk108784881"/>
+    <w:bookmarkStart w:id="3" w:name="_Hlk108784881"/>
     <w:r>
       <w:rPr>
         <w:noProof/>
@@ -6333,7 +6272,7 @@
         </wp:anchor>
       </w:drawing>
     </w:r>
-    <w:bookmarkEnd w:id="5"/>
+    <w:bookmarkEnd w:id="3"/>
   </w:p>
 </w:hdr>
 </file>
@@ -6347,13 +6286,8 @@
         <w:bottom w:val="single" w:sz="4" w:space="1" w:color="auto"/>
       </w:pBdr>
     </w:pPr>
-    <w:proofErr w:type="gramStart"/>
     <w:r>
-      <w:t>Patient :</w:t>
-    </w:r>
-    <w:proofErr w:type="gramEnd"/>
-    <w:r>
-      <w:t xml:space="preserve"> [NPAT-VNAME] [NPAT-NAMZU] [NPAT-NNAME] geb. [NPAT-GBDAT]</w:t>
+      <w:t>Patient : [NPAT-VNAME] [NPAT-NAMZU] [NPAT-NNAME] geb. [NPAT-GBDAT]</w:t>
     </w:r>
     <w:r>
       <w:tab/>
@@ -6755,7 +6689,7 @@
   <w:style w:type="paragraph" w:default="1" w:styleId="Standard">
     <w:name w:val="Normal"/>
     <w:qFormat/>
-    <w:rsid w:val="00563D94"/>
+    <w:rsid w:val="008F5CEF"/>
     <w:rPr>
       <w:rFonts w:ascii="Calibri" w:eastAsia="Calibri" w:hAnsi="Calibri" w:cs="Times New Roman"/>
     </w:rPr>
@@ -6791,7 +6725,7 @@
     <w:uiPriority w:val="1"/>
     <w:semiHidden/>
     <w:unhideWhenUsed/>
-    <w:rsid w:val="00563D94"/>
+    <w:rsid w:val="008F5CEF"/>
   </w:style>
   <w:style w:type="table" w:default="1" w:styleId="NormaleTabelle">
     <w:name w:val="Normal Table"/>
@@ -6813,7 +6747,7 @@
     <w:uiPriority w:val="99"/>
     <w:semiHidden/>
     <w:unhideWhenUsed/>
-    <w:rsid w:val="00563D94"/>
+    <w:rsid w:val="008F5CEF"/>
   </w:style>
   <w:style w:type="character" w:customStyle="1" w:styleId="berschrift1Zchn">
     <w:name w:val="Überschrift 1 Zchn"/>

</xml_diff>